<commit_message>
README: documentos PDF agregados
</commit_message>
<xml_diff>
--- a/DESIGN.docx
+++ b/DESIGN.docx
@@ -129,41 +129,29 @@
         </w:rPr>
       </w:pPr>
       <w:r>
-        <w:rPr>
-          <w:rFonts w:ascii="Lexend Light" w:cs="Lexend Light" w:eastAsia="Lexend Light" w:hAnsi="Lexend Light"/>
-          <w:rtl w:val="0"/>
-        </w:rPr>
-        <w:t xml:space="preserve">La dirección visual toma como referencia principal una estructura editorial dinámica: grandes titulares, imágenes protagonistas, cambios marcados de escala, alternancia entre secciones densas y espacios abiertos, numeraciones, listados y composiciones que pueden cambiar de ritmo a lo largo de la página.</w:t>
-      </w:r>
-    </w:p>
-    <w:p>
-      <w:pPr>
-        <w:spacing w:after="240" w:before="240" w:lineRule="auto"/>
-        <w:rPr>
-          <w:rFonts w:ascii="Lexend Light" w:cs="Lexend Light" w:eastAsia="Lexend Light" w:hAnsi="Lexend Light"/>
-        </w:rPr>
-      </w:pPr>
-      <w:r>
-        <w:rPr>
-          <w:rFonts w:ascii="Lexend Light" w:cs="Lexend Light" w:eastAsia="Lexend Light" w:hAnsi="Lexend Light"/>
-          <w:rtl w:val="0"/>
-        </w:rPr>
-        <w:t xml:space="preserve">La experimentación no depende de acumular elementos. Cada sección debe tener una idea visual dominante y suficiente espacio para desarrollarla. Algunas pueden ser principalmente tipográficas; otras pueden estar construidas alrededor de una imagen, una galería, una lista o un gran bloque de color.</w:t>
-      </w:r>
-    </w:p>
-    <w:p>
-      <w:pPr>
-        <w:spacing w:after="240" w:before="240" w:lineRule="auto"/>
-        <w:rPr>
-          <w:rFonts w:ascii="Lexend Light" w:cs="Lexend Light" w:eastAsia="Lexend Light" w:hAnsi="Lexend Light"/>
-        </w:rPr>
-      </w:pPr>
-      <w:r>
-        <w:rPr>
-          <w:rFonts w:ascii="Lexend Light" w:cs="Lexend Light" w:eastAsia="Lexend Light" w:hAnsi="Lexend Light"/>
-          <w:rtl w:val="0"/>
-        </w:rPr>
-        <w:t xml:space="preserve">La página puede cambiar de composición entre proyectos para mostrar versatilidad, pero conserva como constantes la paleta, las tipografías, los patrones de interacción, la escala de espaciado y ciertas formas de organizar la información.</w:t>
+        <w:t>La dirección visual utiliza una estructura editorial dinámica: grandes titulares, imágenes protagonistas, cambios de escala, fondos de color, numeraciones, galerías, videos y composiciones que cambian de ritmo a lo largo de la página.</w:t>
+      </w:r>
+    </w:p>
+    <w:p>
+      <w:pPr>
+        <w:spacing w:after="240" w:before="240" w:lineRule="auto"/>
+        <w:rPr>
+          <w:rFonts w:ascii="Lexend Light" w:cs="Lexend Light" w:eastAsia="Lexend Light" w:hAnsi="Lexend Light"/>
+        </w:rPr>
+      </w:pPr>
+      <w:r>
+        <w:t>La experimentación no depende de acumular elementos. Cada sección tiene una idea visual dominante: fotografía en Home, composición dividida en About, galerías en Brand e Illustration, video en Motion y tipografía en las transiciones editoriales.</w:t>
+      </w:r>
+    </w:p>
+    <w:p>
+      <w:pPr>
+        <w:spacing w:after="240" w:before="240" w:lineRule="auto"/>
+        <w:rPr>
+          <w:rFonts w:ascii="Lexend Light" w:cs="Lexend Light" w:eastAsia="Lexend Light" w:hAnsi="Lexend Light"/>
+        </w:rPr>
+      </w:pPr>
+      <w:r>
+        <w:t>La página cambia de composición entre secciones, pero conserva como constantes la paleta, las tipografías ITTrivane y Franie, la escala de espaciado, los radios, las animaciones breves y el tratamiento de las interacciones.</w:t>
       </w:r>
     </w:p>
     <w:p>
@@ -310,11 +298,7 @@
         </w:rPr>
       </w:pPr>
       <w:r>
-        <w:rPr>
-          <w:rFonts w:ascii="Lexend Light" w:cs="Lexend Light" w:eastAsia="Lexend Light" w:hAnsi="Lexend Light"/>
-          <w:rtl w:val="0"/>
-        </w:rPr>
-        <w:t xml:space="preserve">Es uno de los colores expresivos de la marca. Lo utilizo para fondos completos de sección, palabras destacadas, etiquetas, elementos gráficos, numeraciones y estados interactivos.</w:t>
+        <w:t>Es el acento interactivo principal. Se utiliza en etiquetas, numeraciones, palabras destacadas, estados hover y en el bloque animado que aparece detrás de algunos títulos.</w:t>
       </w:r>
     </w:p>
     <w:p>
@@ -370,11 +354,7 @@
         </w:rPr>
       </w:pPr>
       <w:r>
-        <w:rPr>
-          <w:rFonts w:ascii="Lexend Light" w:cs="Lexend Light" w:eastAsia="Lexend Light" w:hAnsi="Lexend Light"/>
-          <w:rtl w:val="0"/>
-        </w:rPr>
-        <w:t xml:space="preserve">Es uno de los colores principales de identidad y puede utilizarse en grandes superficies, secciones destacadas, enlaces, elementos interactivos y recursos gráficos.</w:t>
+        <w:t>Es uno de los colores principales de identidad. Se utiliza en la tarjeta de About, en el fondo de “Lo que hago”, en enlaces y en recursos gráficos.</w:t>
       </w:r>
     </w:p>
     <w:p>
@@ -430,11 +410,7 @@
         </w:rPr>
       </w:pPr>
       <w:r>
-        <w:rPr>
-          <w:rFonts w:ascii="Lexend Light" w:cs="Lexend Light" w:eastAsia="Lexend Light" w:hAnsi="Lexend Light"/>
-          <w:rtl w:val="0"/>
-        </w:rPr>
-        <w:t xml:space="preserve">Es el color de mayor energía de la paleta. Lo utilizo para llamadas a la acción, detalles puntuales, números, elementos de navegación, palabras destacadas y secciones específicas que necesitan generar mayor impacto.</w:t>
+        <w:t>Es el color de mayor energía de la paleta. Se utiliza en la sección About, botones, pequeños encabezados, detalles puntuales y llamadas a la acción.</w:t>
       </w:r>
     </w:p>
     <w:p>
@@ -550,11 +526,7 @@
         </w:rPr>
       </w:pPr>
       <w:r>
-        <w:rPr>
-          <w:rFonts w:ascii="Lexend Light" w:cs="Lexend Light" w:eastAsia="Lexend Light" w:hAnsi="Lexend Light"/>
-          <w:rtl w:val="0"/>
-        </w:rPr>
-        <w:t xml:space="preserve">Es el color estructural de mayor contraste. Se utiliza para texto, navegación, líneas divisorias, fondos oscuros, botones y grandes titulares.</w:t>
+        <w:t>Es el color estructural de mayor contraste. Se utiliza para texto, navegación, líneas divisorias, fondos oscuros, botones, títulos y toda la sección Motion.</w:t>
       </w:r>
     </w:p>
     <w:p>
@@ -836,43 +808,7 @@
         </w:rPr>
       </w:pPr>
       <w:r>
-        <w:rPr>
-          <w:rFonts w:ascii="Lexend Light" w:cs="Lexend Light" w:eastAsia="Lexend Light" w:hAnsi="Lexend Light"/>
-          <w:rtl w:val="0"/>
-        </w:rPr>
-        <w:t xml:space="preserve">Uso dos familias tipográficas con roles claramente diferenciados: </w:t>
-      </w:r>
-      <w:r>
-        <w:rPr>
-          <w:rFonts w:ascii="Lexend Light" w:cs="Lexend Light" w:eastAsia="Lexend Light" w:hAnsi="Lexend Light"/>
-          <w:b w:val="1"/>
-          <w:bCs w:val="1"/>
-          <w:rtl w:val="0"/>
-        </w:rPr>
-        <w:t xml:space="preserve">Basori</w:t>
-      </w:r>
-      <w:r>
-        <w:rPr>
-          <w:rFonts w:ascii="Lexend Light" w:cs="Lexend Light" w:eastAsia="Lexend Light" w:hAnsi="Lexend Light"/>
-          <w:rtl w:val="0"/>
-        </w:rPr>
-        <w:t xml:space="preserve"> como tipografía expresiva y </w:t>
-      </w:r>
-      <w:r>
-        <w:rPr>
-          <w:rFonts w:ascii="Lexend Light" w:cs="Lexend Light" w:eastAsia="Lexend Light" w:hAnsi="Lexend Light"/>
-          <w:b w:val="1"/>
-          <w:bCs w:val="1"/>
-          <w:rtl w:val="0"/>
-        </w:rPr>
-        <w:t xml:space="preserve">Franie</w:t>
-      </w:r>
-      <w:r>
-        <w:rPr>
-          <w:rFonts w:ascii="Lexend Light" w:cs="Lexend Light" w:eastAsia="Lexend Light" w:hAnsi="Lexend Light"/>
-          <w:rtl w:val="0"/>
-        </w:rPr>
-        <w:t xml:space="preserve"> como tipografía funcional.</w:t>
+        <w:t>Uso dos familias tipográficas con roles diferenciados: ITTrivane como tipografía expresiva para títulos editoriales y Franie como familia principal para contenido, navegación, etiquetas y composiciones de apoyo.</w:t>
       </w:r>
     </w:p>
     <w:p>
@@ -890,34 +826,19 @@
           <w:szCs w:val="26"/>
         </w:rPr>
       </w:pPr>
-      <w:bookmarkStart w:colFirst="0" w:colLast="0" w:name="_e6bko1dad2hp" w:id="9"/>
-      <w:bookmarkEnd w:id="9"/>
-      <w:r>
-        <w:rPr>
-          <w:rFonts w:ascii="Lexend Light" w:cs="Lexend Light" w:eastAsia="Lexend Light" w:hAnsi="Lexend Light"/>
-          <w:b w:val="1"/>
-          <w:bCs w:val="1"/>
-          <w:color w:val="000000"/>
-          <w:sz w:val="26"/>
-          <w:szCs w:val="26"/>
-          <w:rtl w:val="0"/>
-        </w:rPr>
-        <w:t xml:space="preserve">Basori</w:t>
-      </w:r>
-    </w:p>
-    <w:p>
-      <w:pPr>
-        <w:spacing w:after="240" w:before="240" w:lineRule="auto"/>
-        <w:rPr>
-          <w:rFonts w:ascii="Lexend Light" w:cs="Lexend Light" w:eastAsia="Lexend Light" w:hAnsi="Lexend Light"/>
-        </w:rPr>
-      </w:pPr>
-      <w:r>
-        <w:rPr>
-          <w:rFonts w:ascii="Lexend Light" w:cs="Lexend Light" w:eastAsia="Lexend Light" w:hAnsi="Lexend Light"/>
-          <w:rtl w:val="0"/>
-        </w:rPr>
-        <w:t xml:space="preserve">Basori es la principal tipografía de identidad. Se utiliza para los elementos de mayor impacto:</w:t>
+      <w:r>
+        <w:t>ITTrivane</w:t>
+      </w:r>
+    </w:p>
+    <w:p>
+      <w:pPr>
+        <w:spacing w:after="240" w:before="240" w:lineRule="auto"/>
+        <w:rPr>
+          <w:rFonts w:ascii="Lexend Light" w:cs="Lexend Light" w:eastAsia="Lexend Light" w:hAnsi="Lexend Light"/>
+        </w:rPr>
+      </w:pPr>
+      <w:r>
+        <w:t>ITTrivane es la tipografía expresiva del sistema. Se utiliza principalmente para:</w:t>
       </w:r>
     </w:p>
     <w:p>
@@ -933,11 +854,7 @@
         </w:rPr>
       </w:pPr>
       <w:r>
-        <w:rPr>
-          <w:rFonts w:ascii="Lexend Light" w:cs="Lexend Light" w:eastAsia="Lexend Light" w:hAnsi="Lexend Light"/>
-          <w:rtl w:val="0"/>
-        </w:rPr>
-        <w:t xml:space="preserve">Títulos display.</w:t>
+        <w:t>Títulos de secciones.</w:t>
       </w:r>
     </w:p>
     <w:p>
@@ -953,11 +870,7 @@
         </w:rPr>
       </w:pPr>
       <w:r>
-        <w:rPr>
-          <w:rFonts w:ascii="Lexend Light" w:cs="Lexend Light" w:eastAsia="Lexend Light" w:hAnsi="Lexend Light"/>
-          <w:rtl w:val="0"/>
-        </w:rPr>
-        <w:t xml:space="preserve">Nombres de proyectos.</w:t>
+        <w:t>Nombres de proyectos.</w:t>
       </w:r>
     </w:p>
     <w:p>
@@ -973,11 +886,7 @@
         </w:rPr>
       </w:pPr>
       <w:r>
-        <w:rPr>
-          <w:rFonts w:ascii="Lexend Light" w:cs="Lexend Light" w:eastAsia="Lexend Light" w:hAnsi="Lexend Light"/>
-          <w:rtl w:val="0"/>
-        </w:rPr>
-        <w:t xml:space="preserve">Encabezados principales.</w:t>
+        <w:t>Encabezados editoriales.</w:t>
       </w:r>
     </w:p>
     <w:p>
@@ -993,11 +902,7 @@
         </w:rPr>
       </w:pPr>
       <w:r>
-        <w:rPr>
-          <w:rFonts w:ascii="Lexend Light" w:cs="Lexend Light" w:eastAsia="Lexend Light" w:hAnsi="Lexend Light"/>
-          <w:rtl w:val="0"/>
-        </w:rPr>
-        <w:t xml:space="preserve">Frases breves.</w:t>
+        <w:t>Título de Illustration.</w:t>
       </w:r>
     </w:p>
     <w:p>
@@ -1013,11 +918,7 @@
         </w:rPr>
       </w:pPr>
       <w:r>
-        <w:rPr>
-          <w:rFonts w:ascii="Lexend Light" w:cs="Lexend Light" w:eastAsia="Lexend Light" w:hAnsi="Lexend Light"/>
-          <w:rtl w:val="0"/>
-        </w:rPr>
-        <w:t xml:space="preserve">Palabras destacadas.</w:t>
+        <w:t>Palabras o frases de impacto puntuales.</w:t>
       </w:r>
     </w:p>
     <w:p>
@@ -1033,56 +934,40 @@
         </w:rPr>
       </w:pPr>
       <w:r>
-        <w:rPr>
-          <w:rFonts w:ascii="Lexend Light" w:cs="Lexend Light" w:eastAsia="Lexend Light" w:hAnsi="Lexend Light"/>
-          <w:rtl w:val="0"/>
-        </w:rPr>
-        <w:t xml:space="preserve">Composiciones tipográficas de gran escala.</w:t>
-      </w:r>
-    </w:p>
-    <w:p>
-      <w:pPr>
-        <w:spacing w:after="240" w:before="240" w:lineRule="auto"/>
-        <w:rPr>
-          <w:rFonts w:ascii="Lexend Light" w:cs="Lexend Light" w:eastAsia="Lexend Light" w:hAnsi="Lexend Light"/>
-        </w:rPr>
-      </w:pPr>
-      <w:r>
-        <w:rPr>
-          <w:rFonts w:ascii="Lexend Light" w:cs="Lexend Light" w:eastAsia="Lexend Light" w:hAnsi="Lexend Light"/>
-          <w:rtl w:val="0"/>
-        </w:rPr>
-        <w:t xml:space="preserve">Puede ocupar una parte considerable de la pantalla y funcionar casi como un elemento gráfico.</w:t>
-      </w:r>
-    </w:p>
-    <w:p>
-      <w:pPr>
-        <w:spacing w:after="240" w:before="240" w:lineRule="auto"/>
-        <w:rPr>
-          <w:rFonts w:ascii="Lexend Light" w:cs="Lexend Light" w:eastAsia="Lexend Light" w:hAnsi="Lexend Light"/>
-        </w:rPr>
-      </w:pPr>
-      <w:r>
-        <w:rPr>
-          <w:rFonts w:ascii="Lexend Light" w:cs="Lexend Light" w:eastAsia="Lexend Light" w:hAnsi="Lexend Light"/>
-          <w:rtl w:val="0"/>
-        </w:rPr>
-        <w:t xml:space="preserve">Su tamaño y posición pueden variar significativamente entre secciones. Puede aparecer alineada a la izquierda, centrada, distribuida en varias líneas o combinada con imágenes.</w:t>
-      </w:r>
-    </w:p>
-    <w:p>
-      <w:pPr>
-        <w:spacing w:after="240" w:before="240" w:lineRule="auto"/>
-        <w:rPr>
-          <w:rFonts w:ascii="Lexend Light" w:cs="Lexend Light" w:eastAsia="Lexend Light" w:hAnsi="Lexend Light"/>
-        </w:rPr>
-      </w:pPr>
-      <w:r>
-        <w:rPr>
-          <w:rFonts w:ascii="Lexend Light" w:cs="Lexend Light" w:eastAsia="Lexend Light" w:hAnsi="Lexend Light"/>
-          <w:rtl w:val="0"/>
-        </w:rPr>
-        <w:t xml:space="preserve">No se utiliza para cuerpo de texto, navegación, botones ni información extensa.</w:t>
+        <w:t>Composiciones tipográficas de gran escala.</w:t>
+      </w:r>
+    </w:p>
+    <w:p>
+      <w:pPr>
+        <w:spacing w:after="240" w:before="240" w:lineRule="auto"/>
+        <w:rPr>
+          <w:rFonts w:ascii="Lexend Light" w:cs="Lexend Light" w:eastAsia="Lexend Light" w:hAnsi="Lexend Light"/>
+        </w:rPr>
+      </w:pPr>
+      <w:r>
+        <w:t>Puede ocupar una parte considerable de la pantalla y funcionar como un elemento gráfico dentro de la composición.</w:t>
+      </w:r>
+    </w:p>
+    <w:p>
+      <w:pPr>
+        <w:spacing w:after="240" w:before="240" w:lineRule="auto"/>
+        <w:rPr>
+          <w:rFonts w:ascii="Lexend Light" w:cs="Lexend Light" w:eastAsia="Lexend Light" w:hAnsi="Lexend Light"/>
+        </w:rPr>
+      </w:pPr>
+      <w:r>
+        <w:t>Su posición cambia entre secciones: aparece alineada a la izquierda, a la derecha o integrada con imágenes y galerías.</w:t>
+      </w:r>
+    </w:p>
+    <w:p>
+      <w:pPr>
+        <w:spacing w:after="240" w:before="240" w:lineRule="auto"/>
+        <w:rPr>
+          <w:rFonts w:ascii="Lexend Light" w:cs="Lexend Light" w:eastAsia="Lexend Light" w:hAnsi="Lexend Light"/>
+        </w:rPr>
+      </w:pPr>
+      <w:r>
+        <w:t>No se utiliza para cuerpo de texto, navegación, botones ni información extensa.</w:t>
       </w:r>
     </w:p>
     <w:p>
@@ -1123,26 +1008,18 @@
         </w:rPr>
       </w:pPr>
       <w:r>
-        <w:rPr>
-          <w:rFonts w:ascii="Lexend Light" w:cs="Lexend Light" w:eastAsia="Lexend Light" w:hAnsi="Lexend Light"/>
-          <w:rtl w:val="0"/>
-        </w:rPr>
-        <w:t xml:space="preserve">Franie funciona como tipografía funcional y mantiene la claridad del sistema.</w:t>
-      </w:r>
-    </w:p>
-    <w:p>
-      <w:pPr>
-        <w:spacing w:after="240" w:before="240" w:lineRule="auto"/>
-        <w:rPr>
-          <w:rFonts w:ascii="Lexend Light" w:cs="Lexend Light" w:eastAsia="Lexend Light" w:hAnsi="Lexend Light"/>
-        </w:rPr>
-      </w:pPr>
-      <w:r>
-        <w:rPr>
-          <w:rFonts w:ascii="Lexend Light" w:cs="Lexend Light" w:eastAsia="Lexend Light" w:hAnsi="Lexend Light"/>
-          <w:rtl w:val="0"/>
-        </w:rPr>
-        <w:t xml:space="preserve">Aunque la familia cuenta con múltiples variantes, utilizo principalmente cuatro:</w:t>
+        <w:t>Franie mantiene la claridad del sistema y también asume algunos momentos expresivos, especialmente el hero, la vista rápida, las declaraciones y el menú editorial.</w:t>
+      </w:r>
+    </w:p>
+    <w:p>
+      <w:pPr>
+        <w:spacing w:after="240" w:before="240" w:lineRule="auto"/>
+        <w:rPr>
+          <w:rFonts w:ascii="Lexend Light" w:cs="Lexend Light" w:eastAsia="Lexend Light" w:hAnsi="Lexend Light"/>
+        </w:rPr>
+      </w:pPr>
+      <w:r>
+        <w:t>En la página se utilizan cinco variantes principales:</w:t>
       </w:r>
     </w:p>
     <w:p>
@@ -1158,20 +1035,7 @@
         </w:rPr>
       </w:pPr>
       <w:r>
-        <w:rPr>
-          <w:rFonts w:ascii="Lexend Light" w:cs="Lexend Light" w:eastAsia="Lexend Light" w:hAnsi="Lexend Light"/>
-          <w:b w:val="1"/>
-          <w:bCs w:val="1"/>
-          <w:rtl w:val="0"/>
-        </w:rPr>
-        <w:t xml:space="preserve">Franie Regular:</w:t>
-      </w:r>
-      <w:r>
-        <w:rPr>
-          <w:rFonts w:ascii="Lexend Light" w:cs="Lexend Light" w:eastAsia="Lexend Light" w:hAnsi="Lexend Light"/>
-          <w:rtl w:val="0"/>
-        </w:rPr>
-        <w:t xml:space="preserve"> cuerpo de texto, descripciones, información general y metadatos.</w:t>
+        <w:t>Franie Light: nombre del hero, titulares ligeros y palabras editoriales en cursiva.</w:t>
       </w:r>
     </w:p>
     <w:p>
@@ -1187,20 +1051,7 @@
         </w:rPr>
       </w:pPr>
       <w:r>
-        <w:rPr>
-          <w:rFonts w:ascii="Lexend Light" w:cs="Lexend Light" w:eastAsia="Lexend Light" w:hAnsi="Lexend Light"/>
-          <w:b w:val="1"/>
-          <w:bCs w:val="1"/>
-          <w:rtl w:val="0"/>
-        </w:rPr>
-        <w:t xml:space="preserve">Franie SemiBold:</w:t>
-      </w:r>
-      <w:r>
-        <w:rPr>
-          <w:rFonts w:ascii="Lexend Light" w:cs="Lexend Light" w:eastAsia="Lexend Light" w:hAnsi="Lexend Light"/>
-          <w:rtl w:val="0"/>
-        </w:rPr>
-        <w:t xml:space="preserve"> navegación, botones, enlaces, categorías y etiquetas.</w:t>
+        <w:t>Franie Regular: cuerpo de texto, descripciones, información general y metadatos.</w:t>
       </w:r>
     </w:p>
     <w:p>
@@ -1216,20 +1067,7 @@
         </w:rPr>
       </w:pPr>
       <w:r>
-        <w:rPr>
-          <w:rFonts w:ascii="Lexend Light" w:cs="Lexend Light" w:eastAsia="Lexend Light" w:hAnsi="Lexend Light"/>
-          <w:b w:val="1"/>
-          <w:bCs w:val="1"/>
-          <w:rtl w:val="0"/>
-        </w:rPr>
-        <w:t xml:space="preserve">Franie Bold:</w:t>
-      </w:r>
-      <w:r>
-        <w:rPr>
-          <w:rFonts w:ascii="Lexend Light" w:cs="Lexend Light" w:eastAsia="Lexend Light" w:hAnsi="Lexend Light"/>
-          <w:rtl w:val="0"/>
-        </w:rPr>
-        <w:t xml:space="preserve"> subtítulos, números, años, datos importantes y pequeños encabezados.</w:t>
+        <w:t>Franie SemiBold: navegación, botones, enlaces, categorías y etiquetas.</w:t>
       </w:r>
     </w:p>
     <w:p>
@@ -1245,35 +1083,18 @@
         </w:rPr>
       </w:pPr>
       <w:r>
-        <w:rPr>
-          <w:rFonts w:ascii="Lexend Light" w:cs="Lexend Light" w:eastAsia="Lexend Light" w:hAnsi="Lexend Light"/>
-          <w:b w:val="1"/>
-          <w:bCs w:val="1"/>
-          <w:rtl w:val="0"/>
-        </w:rPr>
-        <w:t xml:space="preserve">Franie Italic:</w:t>
-      </w:r>
-      <w:r>
-        <w:rPr>
-          <w:rFonts w:ascii="Lexend Light" w:cs="Lexend Light" w:eastAsia="Lexend Light" w:hAnsi="Lexend Light"/>
-          <w:rtl w:val="0"/>
-        </w:rPr>
-        <w:t xml:space="preserve"> captions, créditos, notas y elementos editoriales puntuales.</w:t>
-      </w:r>
-    </w:p>
-    <w:p>
-      <w:pPr>
-        <w:spacing w:after="240" w:before="240" w:lineRule="auto"/>
-        <w:rPr>
-          <w:rFonts w:ascii="Lexend Light" w:cs="Lexend Light" w:eastAsia="Lexend Light" w:hAnsi="Lexend Light"/>
-        </w:rPr>
-      </w:pPr>
-      <w:r>
-        <w:rPr>
-          <w:rFonts w:ascii="Lexend Light" w:cs="Lexend Light" w:eastAsia="Lexend Light" w:hAnsi="Lexend Light"/>
-          <w:rtl w:val="0"/>
-        </w:rPr>
-        <w:t xml:space="preserve">Las variantes Hair, ExtraLight, Light, SemiLight, ExtraBold y Black no forman parte de la jerarquía habitual. Pueden utilizarse excepcionalmente en una composición experimental, pero no como estilos recurrentes.</w:t>
+        <w:t>Franie Bold: subtítulos, números, años, títulos de apoyo y datos importantes.</w:t>
+      </w:r>
+    </w:p>
+    <w:p>
+      <w:pPr>
+        <w:spacing w:after="240" w:before="240" w:lineRule="auto"/>
+        <w:rPr>
+          <w:rFonts w:ascii="Lexend Light" w:cs="Lexend Light" w:eastAsia="Lexend Light" w:hAnsi="Lexend Light"/>
+        </w:rPr>
+      </w:pPr>
+      <w:r>
+        <w:t>Franie Italic: palabras editoriales, énfasis, captions y notas puntuales. Los demás pesos no forman parte de la jerarquía habitual.</w:t>
       </w:r>
     </w:p>
     <w:p>
@@ -1319,20 +1140,7 @@
         </w:rPr>
       </w:pPr>
       <w:r>
-        <w:rPr>
-          <w:rFonts w:ascii="Lexend Light" w:cs="Lexend Light" w:eastAsia="Lexend Light" w:hAnsi="Lexend Light"/>
-          <w:b w:val="1"/>
-          <w:bCs w:val="1"/>
-          <w:rtl w:val="0"/>
-        </w:rPr>
-        <w:t xml:space="preserve">Display:</w:t>
-      </w:r>
-      <w:r>
-        <w:rPr>
-          <w:rFonts w:ascii="Lexend Light" w:cs="Lexend Light" w:eastAsia="Lexend Light" w:hAnsi="Lexend Light"/>
-          <w:rtl w:val="0"/>
-        </w:rPr>
-        <w:t xml:space="preserve"> Basori, 96–128px.</w:t>
+        <w:t>Hero: Franie Light, 64–180px mediante escala fluida.</w:t>
       </w:r>
     </w:p>
     <w:p>
@@ -1348,20 +1156,7 @@
         </w:rPr>
       </w:pPr>
       <w:r>
-        <w:rPr>
-          <w:rFonts w:ascii="Lexend Light" w:cs="Lexend Light" w:eastAsia="Lexend Light" w:hAnsi="Lexend Light"/>
-          <w:b w:val="1"/>
-          <w:bCs w:val="1"/>
-          <w:rtl w:val="0"/>
-        </w:rPr>
-        <w:t xml:space="preserve">Título 1:</w:t>
-      </w:r>
-      <w:r>
-        <w:rPr>
-          <w:rFonts w:ascii="Lexend Light" w:cs="Lexend Light" w:eastAsia="Lexend Light" w:hAnsi="Lexend Light"/>
-          <w:rtl w:val="0"/>
-        </w:rPr>
-        <w:t xml:space="preserve"> Basori, 64–80px.</w:t>
+        <w:t>Título de sección: ITTrivane, 44–80px.</w:t>
       </w:r>
     </w:p>
     <w:p>
@@ -1377,20 +1172,7 @@
         </w:rPr>
       </w:pPr>
       <w:r>
-        <w:rPr>
-          <w:rFonts w:ascii="Lexend Light" w:cs="Lexend Light" w:eastAsia="Lexend Light" w:hAnsi="Lexend Light"/>
-          <w:b w:val="1"/>
-          <w:bCs w:val="1"/>
-          <w:rtl w:val="0"/>
-        </w:rPr>
-        <w:t xml:space="preserve">Título 2:</w:t>
-      </w:r>
-      <w:r>
-        <w:rPr>
-          <w:rFonts w:ascii="Lexend Light" w:cs="Lexend Light" w:eastAsia="Lexend Light" w:hAnsi="Lexend Light"/>
-          <w:rtl w:val="0"/>
-        </w:rPr>
-        <w:t xml:space="preserve"> Basori, 44–56px.</w:t>
+        <w:t>Título de proyecto: ITTrivane, 36–56px.</w:t>
       </w:r>
     </w:p>
     <w:p>
@@ -1406,20 +1188,7 @@
         </w:rPr>
       </w:pPr>
       <w:r>
-        <w:rPr>
-          <w:rFonts w:ascii="Lexend Light" w:cs="Lexend Light" w:eastAsia="Lexend Light" w:hAnsi="Lexend Light"/>
-          <w:b w:val="1"/>
-          <w:bCs w:val="1"/>
-          <w:rtl w:val="0"/>
-        </w:rPr>
-        <w:t xml:space="preserve">Título 3:</w:t>
-      </w:r>
-      <w:r>
-        <w:rPr>
-          <w:rFonts w:ascii="Lexend Light" w:cs="Lexend Light" w:eastAsia="Lexend Light" w:hAnsi="Lexend Light"/>
-          <w:rtl w:val="0"/>
-        </w:rPr>
-        <w:t xml:space="preserve"> Franie Bold, 24–28px.</w:t>
+        <w:t>Título de apoyo: Franie Bold, 24–32px.</w:t>
       </w:r>
     </w:p>
     <w:p>
@@ -1435,20 +1204,7 @@
         </w:rPr>
       </w:pPr>
       <w:r>
-        <w:rPr>
-          <w:rFonts w:ascii="Lexend Light" w:cs="Lexend Light" w:eastAsia="Lexend Light" w:hAnsi="Lexend Light"/>
-          <w:b w:val="1"/>
-          <w:bCs w:val="1"/>
-          <w:rtl w:val="0"/>
-        </w:rPr>
-        <w:t xml:space="preserve">Texto destacado:</w:t>
-      </w:r>
-      <w:r>
-        <w:rPr>
-          <w:rFonts w:ascii="Lexend Light" w:cs="Lexend Light" w:eastAsia="Lexend Light" w:hAnsi="Lexend Light"/>
-          <w:rtl w:val="0"/>
-        </w:rPr>
-        <w:t xml:space="preserve"> Franie Bold, 20–24px.</w:t>
+        <w:t>Texto destacado: Franie Bold, 20–24px.</w:t>
       </w:r>
     </w:p>
     <w:p>
@@ -1464,20 +1220,7 @@
         </w:rPr>
       </w:pPr>
       <w:r>
-        <w:rPr>
-          <w:rFonts w:ascii="Lexend Light" w:cs="Lexend Light" w:eastAsia="Lexend Light" w:hAnsi="Lexend Light"/>
-          <w:b w:val="1"/>
-          <w:bCs w:val="1"/>
-          <w:rtl w:val="0"/>
-        </w:rPr>
-        <w:t xml:space="preserve">Cuerpo:</w:t>
-      </w:r>
-      <w:r>
-        <w:rPr>
-          <w:rFonts w:ascii="Lexend Light" w:cs="Lexend Light" w:eastAsia="Lexend Light" w:hAnsi="Lexend Light"/>
-          <w:rtl w:val="0"/>
-        </w:rPr>
-        <w:t xml:space="preserve"> Franie Regular, 18px, interlineado de 26–28px.</w:t>
+        <w:t>Cuerpo: Franie Regular, 14–16px, con interlineado aproximado de 1.5–1.7.</w:t>
       </w:r>
     </w:p>
     <w:p>
@@ -1493,20 +1236,7 @@
         </w:rPr>
       </w:pPr>
       <w:r>
-        <w:rPr>
-          <w:rFonts w:ascii="Lexend Light" w:cs="Lexend Light" w:eastAsia="Lexend Light" w:hAnsi="Lexend Light"/>
-          <w:b w:val="1"/>
-          <w:bCs w:val="1"/>
-          <w:rtl w:val="0"/>
-        </w:rPr>
-        <w:t xml:space="preserve">Navegación:</w:t>
-      </w:r>
-      <w:r>
-        <w:rPr>
-          <w:rFonts w:ascii="Lexend Light" w:cs="Lexend Light" w:eastAsia="Lexend Light" w:hAnsi="Lexend Light"/>
-          <w:rtl w:val="0"/>
-        </w:rPr>
-        <w:t xml:space="preserve"> Franie SemiBold, 16–18px.</w:t>
+        <w:t>Navegación: Franie SemiBold, 16–18px.</w:t>
       </w:r>
     </w:p>
     <w:p>
@@ -1522,20 +1252,7 @@
         </w:rPr>
       </w:pPr>
       <w:r>
-        <w:rPr>
-          <w:rFonts w:ascii="Lexend Light" w:cs="Lexend Light" w:eastAsia="Lexend Light" w:hAnsi="Lexend Light"/>
-          <w:b w:val="1"/>
-          <w:bCs w:val="1"/>
-          <w:rtl w:val="0"/>
-        </w:rPr>
-        <w:t xml:space="preserve">Botones:</w:t>
-      </w:r>
-      <w:r>
-        <w:rPr>
-          <w:rFonts w:ascii="Lexend Light" w:cs="Lexend Light" w:eastAsia="Lexend Light" w:hAnsi="Lexend Light"/>
-          <w:rtl w:val="0"/>
-        </w:rPr>
-        <w:t xml:space="preserve"> Franie SemiBold, 16–18px.</w:t>
+        <w:t>Botones: Franie SemiBold, 16–18px.</w:t>
       </w:r>
     </w:p>
     <w:p>
@@ -1551,20 +1268,7 @@
         </w:rPr>
       </w:pPr>
       <w:r>
-        <w:rPr>
-          <w:rFonts w:ascii="Lexend Light" w:cs="Lexend Light" w:eastAsia="Lexend Light" w:hAnsi="Lexend Light"/>
-          <w:b w:val="1"/>
-          <w:bCs w:val="1"/>
-          <w:rtl w:val="0"/>
-        </w:rPr>
-        <w:t xml:space="preserve">Etiquetas:</w:t>
-      </w:r>
-      <w:r>
-        <w:rPr>
-          <w:rFonts w:ascii="Lexend Light" w:cs="Lexend Light" w:eastAsia="Lexend Light" w:hAnsi="Lexend Light"/>
-          <w:rtl w:val="0"/>
-        </w:rPr>
-        <w:t xml:space="preserve"> Franie SemiBold, 13–14px.</w:t>
+        <w:t>Etiquetas: Franie SemiBold, 14px.</w:t>
       </w:r>
     </w:p>
     <w:p>
@@ -1580,20 +1284,7 @@
         </w:rPr>
       </w:pPr>
       <w:r>
-        <w:rPr>
-          <w:rFonts w:ascii="Lexend Light" w:cs="Lexend Light" w:eastAsia="Lexend Light" w:hAnsi="Lexend Light"/>
-          <w:b w:val="1"/>
-          <w:bCs w:val="1"/>
-          <w:rtl w:val="0"/>
-        </w:rPr>
-        <w:t xml:space="preserve">Metadatos:</w:t>
-      </w:r>
-      <w:r>
-        <w:rPr>
-          <w:rFonts w:ascii="Lexend Light" w:cs="Lexend Light" w:eastAsia="Lexend Light" w:hAnsi="Lexend Light"/>
-          <w:rtl w:val="0"/>
-        </w:rPr>
-        <w:t xml:space="preserve"> Franie Regular, 13–14px.</w:t>
+        <w:t>Metadatos: Franie Regular, 14px.</w:t>
       </w:r>
     </w:p>
     <w:p>
@@ -1609,20 +1300,7 @@
         </w:rPr>
       </w:pPr>
       <w:r>
-        <w:rPr>
-          <w:rFonts w:ascii="Lexend Light" w:cs="Lexend Light" w:eastAsia="Lexend Light" w:hAnsi="Lexend Light"/>
-          <w:b w:val="1"/>
-          <w:bCs w:val="1"/>
-          <w:rtl w:val="0"/>
-        </w:rPr>
-        <w:t xml:space="preserve">Captions:</w:t>
-      </w:r>
-      <w:r>
-        <w:rPr>
-          <w:rFonts w:ascii="Lexend Light" w:cs="Lexend Light" w:eastAsia="Lexend Light" w:hAnsi="Lexend Light"/>
-          <w:rtl w:val="0"/>
-        </w:rPr>
-        <w:t xml:space="preserve"> Franie Italic, 13–14px.</w:t>
+        <w:t>Composiciones editoriales: Franie Light, Bold e Italic, aproximadamente 32–120px según la sección.</w:t>
       </w:r>
     </w:p>
     <w:p>
@@ -1664,26 +1342,18 @@
         </w:rPr>
       </w:pPr>
       <w:r>
-        <w:rPr>
-          <w:rFonts w:ascii="Lexend Light" w:cs="Lexend Light" w:eastAsia="Lexend Light" w:hAnsi="Lexend Light"/>
-          <w:rtl w:val="0"/>
-        </w:rPr>
-        <w:t xml:space="preserve">Basori concentra la personalidad visual. Franie mantiene estable toda la información funcional.</w:t>
-      </w:r>
-    </w:p>
-    <w:p>
-      <w:pPr>
-        <w:spacing w:after="240" w:before="240" w:lineRule="auto"/>
-        <w:rPr>
-          <w:rFonts w:ascii="Lexend Light" w:cs="Lexend Light" w:eastAsia="Lexend Light" w:hAnsi="Lexend Light"/>
-        </w:rPr>
-      </w:pPr>
-      <w:r>
-        <w:rPr>
-          <w:rFonts w:ascii="Lexend Light" w:cs="Lexend Light" w:eastAsia="Lexend Light" w:hAnsi="Lexend Light"/>
-          <w:rtl w:val="0"/>
-        </w:rPr>
-        <w:t xml:space="preserve">Los titulares pueden ser muy grandes, pero el cuerpo de texto debe mantenerse cómodo y legible. La experimentación tipográfica nunca debe dificultar la comprensión del contenido.</w:t>
+        <w:t>ITTrivane concentra los títulos de secciones y proyectos. Franie construye el resto de la experiencia y puede asumir protagonismo en piezas editoriales específicas.</w:t>
+      </w:r>
+    </w:p>
+    <w:p>
+      <w:pPr>
+        <w:spacing w:after="240" w:before="240" w:lineRule="auto"/>
+        <w:rPr>
+          <w:rFonts w:ascii="Lexend Light" w:cs="Lexend Light" w:eastAsia="Lexend Light" w:hAnsi="Lexend Light"/>
+        </w:rPr>
+      </w:pPr>
+      <w:r>
+        <w:t>Los titulares utilizan escalas grandes y fluidas. El cuerpo se mantiene entre 14 y 16px y aumenta su interlineado para conservar legibilidad.</w:t>
       </w:r>
     </w:p>
     <w:p>
@@ -1739,11 +1409,7 @@
         </w:rPr>
       </w:pPr>
       <w:r>
-        <w:rPr>
-          <w:rFonts w:ascii="Lexend Light" w:cs="Lexend Light" w:eastAsia="Lexend Light" w:hAnsi="Lexend Light"/>
-          <w:rtl w:val="0"/>
-        </w:rPr>
-        <w:t xml:space="preserve">El layout utiliza una retícula estructurada como punto de partida, pero permite variaciones entre secciones para evitar que todo el portafolio se sienta construido sobre una sola plantilla.</w:t>
+        <w:t>El layout utiliza una estructura responsiva y retículas específicas para cada sección, en lugar de una sola cuadrícula repetida en todo el portafolio.</w:t>
       </w:r>
     </w:p>
     <w:p>
@@ -1802,44 +1468,18 @@
         </w:rPr>
       </w:pPr>
       <w:r>
-        <w:rPr>
-          <w:rFonts w:ascii="Lexend Light" w:cs="Lexend Light" w:eastAsia="Lexend Light" w:hAnsi="Lexend Light"/>
-          <w:b w:val="1"/>
-          <w:bCs w:val="1"/>
-          <w:rtl w:val="0"/>
-        </w:rPr>
-        <w:t xml:space="preserve">8, 16, 24, 32, 48, 64, 96, 128 y 160px.</w:t>
-      </w:r>
-    </w:p>
-    <w:p>
-      <w:pPr>
-        <w:spacing w:after="240" w:before="240" w:lineRule="auto"/>
-        <w:rPr>
-          <w:rFonts w:ascii="Lexend Light" w:cs="Lexend Light" w:eastAsia="Lexend Light" w:hAnsi="Lexend Light"/>
-        </w:rPr>
-      </w:pPr>
-      <w:r>
-        <w:rPr>
-          <w:rFonts w:ascii="Lexend Light" w:cs="Lexend Light" w:eastAsia="Lexend Light" w:hAnsi="Lexend Light"/>
-          <w:rtl w:val="0"/>
-        </w:rPr>
-        <w:t xml:space="preserve">En escritorio utilizo una retícula de </w:t>
-      </w:r>
-      <w:r>
-        <w:rPr>
-          <w:rFonts w:ascii="Lexend Light" w:cs="Lexend Light" w:eastAsia="Lexend Light" w:hAnsi="Lexend Light"/>
-          <w:b w:val="1"/>
-          <w:bCs w:val="1"/>
-          <w:rtl w:val="0"/>
-        </w:rPr>
-        <w:t xml:space="preserve">12 columnas</w:t>
-      </w:r>
-      <w:r>
-        <w:rPr>
-          <w:rFonts w:ascii="Lexend Light" w:cs="Lexend Light" w:eastAsia="Lexend Light" w:hAnsi="Lexend Light"/>
-          <w:rtl w:val="0"/>
-        </w:rPr>
-        <w:t xml:space="preserve">. En tableta, 8 columnas. En móvil, 4 columnas.</w:t>
+        <w:t>8, 16, 24, 32, 48, 64, 96 y 128px.</w:t>
+      </w:r>
+    </w:p>
+    <w:p>
+      <w:pPr>
+        <w:spacing w:after="240" w:before="240" w:lineRule="auto"/>
+        <w:rPr>
+          <w:rFonts w:ascii="Lexend Light" w:cs="Lexend Light" w:eastAsia="Lexend Light" w:hAnsi="Lexend Light"/>
+        </w:rPr>
+      </w:pPr>
+      <w:r>
+        <w:t>Las secciones utilizan retículas de una, dos, tres o cuatro columnas según el contenido. En móvil, casi todas se reorganizan en una columna; algunas galerías conservan dos columnas cuando el espacio lo permite.</w:t>
       </w:r>
     </w:p>
     <w:p>
@@ -1881,27 +1521,7 @@
         </w:rPr>
       </w:pPr>
       <w:r>
-        <w:rPr>
-          <w:rFonts w:ascii="Lexend Light" w:cs="Lexend Light" w:eastAsia="Lexend Light" w:hAnsi="Lexend Light"/>
-          <w:rtl w:val="0"/>
-        </w:rPr>
-        <w:t xml:space="preserve">Las secciones principales se separan normalmente entre </w:t>
-      </w:r>
-      <w:r>
-        <w:rPr>
-          <w:rFonts w:ascii="Lexend Light" w:cs="Lexend Light" w:eastAsia="Lexend Light" w:hAnsi="Lexend Light"/>
-          <w:b w:val="1"/>
-          <w:bCs w:val="1"/>
-          <w:rtl w:val="0"/>
-        </w:rPr>
-        <w:t xml:space="preserve">96 y 160px</w:t>
-      </w:r>
-      <w:r>
-        <w:rPr>
-          <w:rFonts w:ascii="Lexend Light" w:cs="Lexend Light" w:eastAsia="Lexend Light" w:hAnsi="Lexend Light"/>
-          <w:rtl w:val="0"/>
-        </w:rPr>
-        <w:t xml:space="preserve">, mientras que los elementos relacionados dentro de una sección utilizan distancias entre 16 y 64px.</w:t>
+        <w:t>Las secciones principales se separan normalmente entre 96 y 128px. Los elementos relacionados dentro de una sección utilizan distancias entre 8 y 64px.</w:t>
       </w:r>
     </w:p>
     <w:p>
@@ -1957,11 +1577,7 @@
         </w:rPr>
       </w:pPr>
       <w:r>
-        <w:rPr>
-          <w:rFonts w:ascii="Lexend Light" w:cs="Lexend Light" w:eastAsia="Lexend Light" w:hAnsi="Lexend Light"/>
-          <w:rtl w:val="0"/>
-        </w:rPr>
-        <w:t xml:space="preserve">Una puede estar dominada por un gran titular, otra por una imagen prácticamente a pantalla completa y otra por una composición más pequeña de texto, numeración e imagen.</w:t>
+        <w:t>Home se construye con fotografía a pantalla completa; About divide fotografía y texto; Brand utiliza galerías; Motion contrasta dos videos; Illustration combina texto fijo y una retícula de seis piezas.</w:t>
       </w:r>
     </w:p>
     <w:p>
@@ -2027,11 +1643,7 @@
         </w:rPr>
       </w:pPr>
       <w:r>
-        <w:rPr>
-          <w:rFonts w:ascii="Lexend Light" w:cs="Lexend Light" w:eastAsia="Lexend Light" w:hAnsi="Lexend Light"/>
-          <w:rtl w:val="0"/>
-        </w:rPr>
-        <w:t xml:space="preserve">Imágenes de distintas proporciones.</w:t>
+        <w:t>Imágenes de proporciones consistentes dentro de cada galería y videos verticales u horizontales según el proyecto.</w:t>
       </w:r>
     </w:p>
     <w:p>
@@ -2286,11 +1898,7 @@
         </w:rPr>
       </w:pPr>
       <w:r>
-        <w:rPr>
-          <w:rFonts w:ascii="Lexend Light" w:cs="Lexend Light" w:eastAsia="Lexend Light" w:hAnsi="Lexend Light"/>
-          <w:rtl w:val="0"/>
-        </w:rPr>
-        <w:t xml:space="preserve">No utilizo dos grandes rectángulos o tarjetas montados uno sobre otro para generar dinamismo.</w:t>
+        <w:t>No utilizo dos grandes rectángulos montados uno sobre otro para generar dinamismo.</w:t>
       </w:r>
     </w:p>
     <w:p>
@@ -2346,11 +1954,7 @@
         </w:rPr>
       </w:pPr>
       <w:r>
-        <w:rPr>
-          <w:rFonts w:ascii="Lexend Light" w:cs="Lexend Light" w:eastAsia="Lexend Light" w:hAnsi="Lexend Light"/>
-          <w:rtl w:val="0"/>
-        </w:rPr>
-        <w:t xml:space="preserve">Si existe alguna superposición, queda limitada a elementos pequeños y deliberados, como:</w:t>
+        <w:t>Las superposiciones se limitan a elementos pequeños, funcionales o transitorios, como:</w:t>
       </w:r>
     </w:p>
     <w:p>
@@ -2366,11 +1970,7 @@
         </w:rPr>
       </w:pPr>
       <w:r>
-        <w:rPr>
-          <w:rFonts w:ascii="Lexend Light" w:cs="Lexend Light" w:eastAsia="Lexend Light" w:hAnsi="Lexend Light"/>
-          <w:rtl w:val="0"/>
-        </w:rPr>
-        <w:t xml:space="preserve">Una palabra sobre una imagen.</w:t>
+        <w:t>El bloque rosa animado detrás de algunos títulos.</w:t>
       </w:r>
     </w:p>
     <w:p>
@@ -2446,11 +2046,7 @@
         </w:rPr>
       </w:pPr>
       <w:r>
-        <w:rPr>
-          <w:rFonts w:ascii="Lexend Light" w:cs="Lexend Light" w:eastAsia="Lexend Light" w:hAnsi="Lexend Light"/>
-          <w:rtl w:val="0"/>
-        </w:rPr>
-        <w:t xml:space="preserve">Un pequeño elemento decorativo.</w:t>
+        <w:t>Controles del lightbox y pequeños elementos decorativos.</w:t>
       </w:r>
     </w:p>
     <w:p>
@@ -2627,11 +2223,7 @@
         </w:rPr>
       </w:pPr>
       <w:r>
-        <w:rPr>
-          <w:rFonts w:ascii="Lexend Light" w:cs="Lexend Light" w:eastAsia="Lexend Light" w:hAnsi="Lexend Light"/>
-          <w:rtl w:val="0"/>
-        </w:rPr>
-        <w:t xml:space="preserve">Texto, navegación, imágenes, galerías y contenido general permanecen sin sombra.</w:t>
+        <w:t>Texto, navegación, imágenes, galerías y contenido general permanecen sin sombra en estado normal.</w:t>
       </w:r>
     </w:p>
     <w:p>
@@ -2762,26 +2354,18 @@
         </w:rPr>
       </w:pPr>
       <w:r>
-        <w:rPr>
-          <w:rFonts w:ascii="Lexend Light" w:cs="Lexend Light" w:eastAsia="Lexend Light" w:hAnsi="Lexend Light"/>
-          <w:rtl w:val="0"/>
-        </w:rPr>
-        <w:t xml:space="preserve">Los elementos interactivos pueden desplazarse ligeramente, cambiar de color, escalar o revelar información al pasar el cursor.</w:t>
-      </w:r>
-    </w:p>
-    <w:p>
-      <w:pPr>
-        <w:spacing w:after="240" w:before="240" w:lineRule="auto"/>
-        <w:rPr>
-          <w:rFonts w:ascii="Lexend Light" w:cs="Lexend Light" w:eastAsia="Lexend Light" w:hAnsi="Lexend Light"/>
-        </w:rPr>
-      </w:pPr>
-      <w:r>
-        <w:rPr>
-          <w:rFonts w:ascii="Lexend Light" w:cs="Lexend Light" w:eastAsia="Lexend Light" w:hAnsi="Lexend Light"/>
-          <w:rtl w:val="0"/>
-        </w:rPr>
-        <w:t xml:space="preserve">Las sombras se utilizan únicamente cuando sea necesario distinguir un elemento interactivo flotante. Deben ser suaves y discretas.</w:t>
+        <w:t>Los elementos interactivos pueden desplazarse ligeramente, cambiar de color, escalar, subrayarse o abrir una vista ampliada.</w:t>
+      </w:r>
+    </w:p>
+    <w:p>
+      <w:pPr>
+        <w:spacing w:after="240" w:before="240" w:lineRule="auto"/>
+        <w:rPr>
+          <w:rFonts w:ascii="Lexend Light" w:cs="Lexend Light" w:eastAsia="Lexend Light" w:hAnsi="Lexend Light"/>
+        </w:rPr>
+      </w:pPr>
+      <w:r>
+        <w:t>Las sombras aparecen únicamente en hover para separar botones, tarjetas o imágenes. Son suaves, breves y discretas.</w:t>
       </w:r>
     </w:p>
     <w:p>
@@ -2882,11 +2466,7 @@
         </w:rPr>
       </w:pPr>
       <w:r>
-        <w:rPr>
-          <w:rFonts w:ascii="Lexend Light" w:cs="Lexend Light" w:eastAsia="Lexend Light" w:hAnsi="Lexend Light"/>
-          <w:rtl w:val="0"/>
-        </w:rPr>
-        <w:t xml:space="preserve">Los radios principales son:</w:t>
+        <w:t>Los radios principales aplicados son:</w:t>
       </w:r>
     </w:p>
     <w:p>
@@ -2902,20 +2482,7 @@
         </w:rPr>
       </w:pPr>
       <w:r>
-        <w:rPr>
-          <w:rFonts w:ascii="Lexend Light" w:cs="Lexend Light" w:eastAsia="Lexend Light" w:hAnsi="Lexend Light"/>
-          <w:b w:val="1"/>
-          <w:bCs w:val="1"/>
-          <w:rtl w:val="0"/>
-        </w:rPr>
-        <w:t xml:space="preserve">0px:</w:t>
-      </w:r>
-      <w:r>
-        <w:rPr>
-          <w:rFonts w:ascii="Lexend Light" w:cs="Lexend Light" w:eastAsia="Lexend Light" w:hAnsi="Lexend Light"/>
-          <w:rtl w:val="0"/>
-        </w:rPr>
-        <w:t xml:space="preserve"> imágenes, galerías, bloques editoriales y grandes superficies.</w:t>
+        <w:t>24px: imágenes, galerías, videos, tarjetas de proyecto y componentes visuales.</w:t>
       </w:r>
     </w:p>
     <w:p>
@@ -2931,20 +2498,7 @@
         </w:rPr>
       </w:pPr>
       <w:r>
-        <w:rPr>
-          <w:rFonts w:ascii="Lexend Light" w:cs="Lexend Light" w:eastAsia="Lexend Light" w:hAnsi="Lexend Light"/>
-          <w:b w:val="1"/>
-          <w:bCs w:val="1"/>
-          <w:rtl w:val="0"/>
-        </w:rPr>
-        <w:t xml:space="preserve">16–24px:</w:t>
-      </w:r>
-      <w:r>
-        <w:rPr>
-          <w:rFonts w:ascii="Lexend Light" w:cs="Lexend Light" w:eastAsia="Lexend Light" w:hAnsi="Lexend Light"/>
-          <w:rtl w:val="0"/>
-        </w:rPr>
-        <w:t xml:space="preserve"> componentes especiales que necesitan suavidad.</w:t>
+        <w:t>32px: contenedores editoriales grandes, como la tarjeta del menú “Lo que hago”.</w:t>
       </w:r>
     </w:p>
     <w:p>
@@ -2960,20 +2514,7 @@
         </w:rPr>
       </w:pPr>
       <w:r>
-        <w:rPr>
-          <w:rFonts w:ascii="Lexend Light" w:cs="Lexend Light" w:eastAsia="Lexend Light" w:hAnsi="Lexend Light"/>
-          <w:b w:val="1"/>
-          <w:bCs w:val="1"/>
-          <w:rtl w:val="0"/>
-        </w:rPr>
-        <w:t xml:space="preserve">999px:</w:t>
-      </w:r>
-      <w:r>
-        <w:rPr>
-          <w:rFonts w:ascii="Lexend Light" w:cs="Lexend Light" w:eastAsia="Lexend Light" w:hAnsi="Lexend Light"/>
-          <w:rtl w:val="0"/>
-        </w:rPr>
-        <w:t xml:space="preserve"> botones, etiquetas y chips.</w:t>
+        <w:t>999px: botones, etiquetas y chips.</w:t>
       </w:r>
     </w:p>
     <w:p>
@@ -2989,20 +2530,7 @@
         </w:rPr>
       </w:pPr>
       <w:r>
-        <w:rPr>
-          <w:rFonts w:ascii="Lexend Light" w:cs="Lexend Light" w:eastAsia="Lexend Light" w:hAnsi="Lexend Light"/>
-          <w:b w:val="1"/>
-          <w:bCs w:val="1"/>
-          <w:rtl w:val="0"/>
-        </w:rPr>
-        <w:t xml:space="preserve">50%:</w:t>
-      </w:r>
-      <w:r>
-        <w:rPr>
-          <w:rFonts w:ascii="Lexend Light" w:cs="Lexend Light" w:eastAsia="Lexend Light" w:hAnsi="Lexend Light"/>
-          <w:rtl w:val="0"/>
-        </w:rPr>
-        <w:t xml:space="preserve"> elementos circulares e indicadores.</w:t>
+        <w:t>50%: iconos, enlaces sociales e indicadores circulares.</w:t>
       </w:r>
     </w:p>
     <w:p>
@@ -3028,11 +2556,7 @@
         </w:rPr>
       </w:pPr>
       <w:r>
-        <w:rPr>
-          <w:rFonts w:ascii="Lexend Light" w:cs="Lexend Light" w:eastAsia="Lexend Light" w:hAnsi="Lexend Light"/>
-          <w:rtl w:val="0"/>
-        </w:rPr>
-        <w:t xml:space="preserve">Los rectángulos redondeados grandes se utilizan con moderación.</w:t>
+        <w:t>Los rectángulos redondeados grandes se utilizan en componentes autónomos y se equilibran con secciones de fondo completo.</w:t>
       </w:r>
     </w:p>
     <w:p>
@@ -3163,90 +2687,64 @@
         </w:rPr>
       </w:pPr>
       <w:r>
-        <w:rPr>
-          <w:rFonts w:ascii="Lexend Light" w:cs="Lexend Light" w:eastAsia="Lexend Light" w:hAnsi="Lexend Light"/>
-          <w:rtl w:val="0"/>
-        </w:rPr>
-        <w:t xml:space="preserve">Utiliza Franie SemiBold a 16–18px.</w:t>
-      </w:r>
-    </w:p>
-    <w:p>
-      <w:pPr>
-        <w:spacing w:after="240" w:before="240" w:lineRule="auto"/>
-        <w:rPr>
-          <w:rFonts w:ascii="Lexend Light" w:cs="Lexend Light" w:eastAsia="Lexend Light" w:hAnsi="Lexend Light"/>
-        </w:rPr>
-      </w:pPr>
-      <w:r>
-        <w:rPr>
-          <w:rFonts w:ascii="Lexend Light" w:cs="Lexend Light" w:eastAsia="Lexend Light" w:hAnsi="Lexend Light"/>
-          <w:rtl w:val="0"/>
-        </w:rPr>
-        <w:t xml:space="preserve">Puede incluir:</w:t>
-      </w:r>
-    </w:p>
-    <w:p>
-      <w:pPr>
-        <w:spacing w:after="240" w:before="240" w:lineRule="auto"/>
-        <w:rPr>
-          <w:rFonts w:ascii="Lexend Light" w:cs="Lexend Light" w:eastAsia="Lexend Light" w:hAnsi="Lexend Light"/>
-          <w:b w:val="1"/>
-          <w:bCs w:val="1"/>
-        </w:rPr>
-      </w:pPr>
-      <w:r>
-        <w:rPr>
-          <w:rFonts w:ascii="Lexend Light" w:cs="Lexend Light" w:eastAsia="Lexend Light" w:hAnsi="Lexend Light"/>
-          <w:b w:val="1"/>
-          <w:bCs w:val="1"/>
-          <w:rtl w:val="0"/>
-        </w:rPr>
-        <w:t xml:space="preserve">Work — About — Contact</w:t>
-      </w:r>
-    </w:p>
-    <w:p>
-      <w:pPr>
-        <w:spacing w:after="240" w:before="240" w:lineRule="auto"/>
-        <w:rPr>
-          <w:rFonts w:ascii="Lexend Light" w:cs="Lexend Light" w:eastAsia="Lexend Light" w:hAnsi="Lexend Light"/>
-        </w:rPr>
-      </w:pPr>
-      <w:r>
-        <w:rPr>
-          <w:rFonts w:ascii="Lexend Light" w:cs="Lexend Light" w:eastAsia="Lexend Light" w:hAnsi="Lexend Light"/>
-          <w:rtl w:val="0"/>
-        </w:rPr>
-        <w:t xml:space="preserve">El nombre, logotipo o identificador personal aparece en el extremo opuesto.</w:t>
-      </w:r>
-    </w:p>
-    <w:p>
-      <w:pPr>
-        <w:spacing w:after="240" w:before="240" w:lineRule="auto"/>
-        <w:rPr>
-          <w:rFonts w:ascii="Lexend Light" w:cs="Lexend Light" w:eastAsia="Lexend Light" w:hAnsi="Lexend Light"/>
-        </w:rPr>
-      </w:pPr>
-      <w:r>
-        <w:rPr>
-          <w:rFonts w:ascii="Lexend Light" w:cs="Lexend Light" w:eastAsia="Lexend Light" w:hAnsi="Lexend Light"/>
-          <w:rtl w:val="0"/>
-        </w:rPr>
-        <w:t xml:space="preserve">La navegación puede invertir su color según el fondo de la sección.</w:t>
-      </w:r>
-    </w:p>
-    <w:p>
-      <w:pPr>
-        <w:spacing w:after="240" w:before="240" w:lineRule="auto"/>
-        <w:rPr>
-          <w:rFonts w:ascii="Lexend Light" w:cs="Lexend Light" w:eastAsia="Lexend Light" w:hAnsi="Lexend Light"/>
-        </w:rPr>
-      </w:pPr>
-      <w:r>
-        <w:rPr>
-          <w:rFonts w:ascii="Lexend Light" w:cs="Lexend Light" w:eastAsia="Lexend Light" w:hAnsi="Lexend Light"/>
-          <w:rtl w:val="0"/>
-        </w:rPr>
-        <w:t xml:space="preserve">En hover, los enlaces pueden:</w:t>
+        <w:t>Utiliza Franie SemiBold a 16–18px.</w:t>
+      </w:r>
+    </w:p>
+    <w:p>
+      <w:pPr>
+        <w:spacing w:after="240" w:before="240" w:lineRule="auto"/>
+        <w:rPr>
+          <w:rFonts w:ascii="Lexend Light" w:cs="Lexend Light" w:eastAsia="Lexend Light" w:hAnsi="Lexend Light"/>
+        </w:rPr>
+      </w:pPr>
+      <w:r>
+        <w:t>Incluye:</w:t>
+      </w:r>
+    </w:p>
+    <w:p>
+      <w:pPr>
+        <w:spacing w:after="240" w:before="240" w:lineRule="auto"/>
+        <w:rPr>
+          <w:rFonts w:ascii="Lexend Light" w:cs="Lexend Light" w:eastAsia="Lexend Light" w:hAnsi="Lexend Light"/>
+          <w:b w:val="1"/>
+          <w:bCs w:val="1"/>
+        </w:rPr>
+      </w:pPr>
+      <w:r>
+        <w:t>Home — About — Brand — Motion — Illustration — Contact</w:t>
+      </w:r>
+    </w:p>
+    <w:p>
+      <w:pPr>
+        <w:spacing w:after="240" w:before="240" w:lineRule="auto"/>
+        <w:rPr>
+          <w:rFonts w:ascii="Lexend Light" w:cs="Lexend Light" w:eastAsia="Lexend Light" w:hAnsi="Lexend Light"/>
+        </w:rPr>
+      </w:pPr>
+      <w:r>
+        <w:t>El isotipo y el nombre “Luu García” aparecen en el extremo opuesto.</w:t>
+      </w:r>
+    </w:p>
+    <w:p>
+      <w:pPr>
+        <w:spacing w:after="240" w:before="240" w:lineRule="auto"/>
+        <w:rPr>
+          <w:rFonts w:ascii="Lexend Light" w:cs="Lexend Light" w:eastAsia="Lexend Light" w:hAnsi="Lexend Light"/>
+        </w:rPr>
+      </w:pPr>
+      <w:r>
+        <w:t>La navegación invierte su color sobre el hero y vuelve a negro sobre el fondo beige.</w:t>
+      </w:r>
+    </w:p>
+    <w:p>
+      <w:pPr>
+        <w:spacing w:after="240" w:before="240" w:lineRule="auto"/>
+        <w:rPr>
+          <w:rFonts w:ascii="Lexend Light" w:cs="Lexend Light" w:eastAsia="Lexend Light" w:hAnsi="Lexend Light"/>
+        </w:rPr>
+      </w:pPr>
+      <w:r>
+        <w:t>En hover, los enlaces:</w:t>
       </w:r>
     </w:p>
     <w:p>
@@ -3262,11 +2760,7 @@
         </w:rPr>
       </w:pPr>
       <w:r>
-        <w:rPr>
-          <w:rFonts w:ascii="Lexend Light" w:cs="Lexend Light" w:eastAsia="Lexend Light" w:hAnsi="Lexend Light"/>
-          <w:rtl w:val="0"/>
-        </w:rPr>
-        <w:t xml:space="preserve">Cambiar de color.</w:t>
+        <w:t>Cambian a rosa.</w:t>
       </w:r>
     </w:p>
     <w:p>
@@ -3282,11 +2776,7 @@
         </w:rPr>
       </w:pPr>
       <w:r>
-        <w:rPr>
-          <w:rFonts w:ascii="Lexend Light" w:cs="Lexend Light" w:eastAsia="Lexend Light" w:hAnsi="Lexend Light"/>
-          <w:rtl w:val="0"/>
-        </w:rPr>
-        <w:t xml:space="preserve">Mostrar un subrayado.</w:t>
+        <w:t>Revelan un subrayado rosa.</w:t>
       </w:r>
     </w:p>
     <w:p>
@@ -3302,11 +2792,7 @@
         </w:rPr>
       </w:pPr>
       <w:r>
-        <w:rPr>
-          <w:rFonts w:ascii="Lexend Light" w:cs="Lexend Light" w:eastAsia="Lexend Light" w:hAnsi="Lexend Light"/>
-          <w:rtl w:val="0"/>
-        </w:rPr>
-        <w:t xml:space="preserve">Desplazarse ligeramente.</w:t>
+        <w:t>Mantienen una transición breve y visible.</w:t>
       </w:r>
     </w:p>
     <w:p>
@@ -3322,11 +2808,7 @@
         </w:rPr>
       </w:pPr>
       <w:r>
-        <w:rPr>
-          <w:rFonts w:ascii="Lexend Light" w:cs="Lexend Light" w:eastAsia="Lexend Light" w:hAnsi="Lexend Light"/>
-          <w:rtl w:val="0"/>
-        </w:rPr>
-        <w:t xml:space="preserve">Incorporar una pequeña flecha o indicador.</w:t>
+        <w:t>En móvil, se sustituyen por un menú hamburguesa de pantalla completa.</w:t>
       </w:r>
     </w:p>
     <w:p>
@@ -3382,41 +2864,29 @@
         </w:rPr>
       </w:pPr>
       <w:r>
-        <w:rPr>
-          <w:rFonts w:ascii="Lexend Light" w:cs="Lexend Light" w:eastAsia="Lexend Light" w:hAnsi="Lexend Light"/>
-          <w:rtl w:val="0"/>
-        </w:rPr>
-        <w:t xml:space="preserve">El hero es principalmente tipográfico.</w:t>
-      </w:r>
-    </w:p>
-    <w:p>
-      <w:pPr>
-        <w:spacing w:after="240" w:before="240" w:lineRule="auto"/>
-        <w:rPr>
-          <w:rFonts w:ascii="Lexend Light" w:cs="Lexend Light" w:eastAsia="Lexend Light" w:hAnsi="Lexend Light"/>
-        </w:rPr>
-      </w:pPr>
-      <w:r>
-        <w:rPr>
-          <w:rFonts w:ascii="Lexend Light" w:cs="Lexend Light" w:eastAsia="Lexend Light" w:hAnsi="Lexend Light"/>
-          <w:rtl w:val="0"/>
-        </w:rPr>
-        <w:t xml:space="preserve">Basori aparece a gran escala acompañada por una descripción breve de mi práctica como diseñadora.</w:t>
-      </w:r>
-    </w:p>
-    <w:p>
-      <w:pPr>
-        <w:spacing w:after="240" w:before="240" w:lineRule="auto"/>
-        <w:rPr>
-          <w:rFonts w:ascii="Lexend Light" w:cs="Lexend Light" w:eastAsia="Lexend Light" w:hAnsi="Lexend Light"/>
-        </w:rPr>
-      </w:pPr>
-      <w:r>
-        <w:rPr>
-          <w:rFonts w:ascii="Lexend Light" w:cs="Lexend Light" w:eastAsia="Lexend Light" w:hAnsi="Lexend Light"/>
-          <w:rtl w:val="0"/>
-        </w:rPr>
-        <w:t xml:space="preserve">La composición puede combinar:</w:t>
+        <w:t>El hero combina fotografía a pantalla completa y tipografía de gran escala.</w:t>
+      </w:r>
+    </w:p>
+    <w:p>
+      <w:pPr>
+        <w:spacing w:after="240" w:before="240" w:lineRule="auto"/>
+        <w:rPr>
+          <w:rFonts w:ascii="Lexend Light" w:cs="Lexend Light" w:eastAsia="Lexend Light" w:hAnsi="Lexend Light"/>
+        </w:rPr>
+      </w:pPr>
+      <w:r>
+        <w:t>El nombre “Luu García” aparece en Franie Light sobre una capa oscura, acompañado por las etiquetas Brand, Motion e Illustration.</w:t>
+      </w:r>
+    </w:p>
+    <w:p>
+      <w:pPr>
+        <w:spacing w:after="240" w:before="240" w:lineRule="auto"/>
+        <w:rPr>
+          <w:rFonts w:ascii="Lexend Light" w:cs="Lexend Light" w:eastAsia="Lexend Light" w:hAnsi="Lexend Light"/>
+        </w:rPr>
+      </w:pPr>
+      <w:r>
+        <w:t>La composición incluye:</w:t>
       </w:r>
     </w:p>
     <w:p>
@@ -3432,11 +2902,7 @@
         </w:rPr>
       </w:pPr>
       <w:r>
-        <w:rPr>
-          <w:rFonts w:ascii="Lexend Light" w:cs="Lexend Light" w:eastAsia="Lexend Light" w:hAnsi="Lexend Light"/>
-          <w:rtl w:val="0"/>
-        </w:rPr>
-        <w:t xml:space="preserve">Un gran titular.</w:t>
+        <w:t>Fotografía personal de fondo.</w:t>
       </w:r>
     </w:p>
     <w:p>
@@ -3452,11 +2918,7 @@
         </w:rPr>
       </w:pPr>
       <w:r>
-        <w:rPr>
-          <w:rFonts w:ascii="Lexend Light" w:cs="Lexend Light" w:eastAsia="Lexend Light" w:hAnsi="Lexend Light"/>
-          <w:rtl w:val="0"/>
-        </w:rPr>
-        <w:t xml:space="preserve">Una frase secundaria en Franie.</w:t>
+        <w:t>Nombre dividido en dos líneas.</w:t>
       </w:r>
     </w:p>
     <w:p>
@@ -3472,11 +2934,7 @@
         </w:rPr>
       </w:pPr>
       <w:r>
-        <w:rPr>
-          <w:rFonts w:ascii="Lexend Light" w:cs="Lexend Light" w:eastAsia="Lexend Light" w:hAnsi="Lexend Light"/>
-          <w:rtl w:val="0"/>
-        </w:rPr>
-        <w:t xml:space="preserve">Una imagen.</w:t>
+        <w:t>Capa oscura para asegurar contraste.</w:t>
       </w:r>
     </w:p>
     <w:p>
@@ -3492,11 +2950,7 @@
         </w:rPr>
       </w:pPr>
       <w:r>
-        <w:rPr>
-          <w:rFonts w:ascii="Lexend Light" w:cs="Lexend Light" w:eastAsia="Lexend Light" w:hAnsi="Lexend Light"/>
-          <w:rtl w:val="0"/>
-        </w:rPr>
-        <w:t xml:space="preserve">Una pieza de trabajo.</w:t>
+        <w:t>Tres etiquetas de especialidad.</w:t>
       </w:r>
     </w:p>
     <w:p>
@@ -3512,11 +2966,7 @@
         </w:rPr>
       </w:pPr>
       <w:r>
-        <w:rPr>
-          <w:rFonts w:ascii="Lexend Light" w:cs="Lexend Light" w:eastAsia="Lexend Light" w:hAnsi="Lexend Light"/>
-          <w:rtl w:val="0"/>
-        </w:rPr>
-        <w:t xml:space="preserve">Un pequeño elemento gráfico.</w:t>
+        <w:t>Animación de aparición breve.</w:t>
       </w:r>
     </w:p>
     <w:p>
@@ -3532,26 +2982,18 @@
         </w:rPr>
       </w:pPr>
       <w:r>
-        <w:rPr>
-          <w:rFonts w:ascii="Lexend Light" w:cs="Lexend Light" w:eastAsia="Lexend Light" w:hAnsi="Lexend Light"/>
-          <w:rtl w:val="0"/>
-        </w:rPr>
-        <w:t xml:space="preserve">Información sobre mi disciplina o ubicación.</w:t>
-      </w:r>
-    </w:p>
-    <w:p>
-      <w:pPr>
-        <w:spacing w:after="240" w:before="240" w:lineRule="auto"/>
-        <w:rPr>
-          <w:rFonts w:ascii="Lexend Light" w:cs="Lexend Light" w:eastAsia="Lexend Light" w:hAnsi="Lexend Light"/>
-        </w:rPr>
-      </w:pPr>
-      <w:r>
-        <w:rPr>
-          <w:rFonts w:ascii="Lexend Light" w:cs="Lexend Light" w:eastAsia="Lexend Light" w:hAnsi="Lexend Light"/>
-          <w:rtl w:val="0"/>
-        </w:rPr>
-        <w:t xml:space="preserve">El hero tiene suficiente espacio para respirar y no depende de varias tarjetas para crear impacto.</w:t>
+        <w:t>Navegación clara sobre el fondo.</w:t>
+      </w:r>
+    </w:p>
+    <w:p>
+      <w:pPr>
+        <w:spacing w:after="240" w:before="240" w:lineRule="auto"/>
+        <w:rPr>
+          <w:rFonts w:ascii="Lexend Light" w:cs="Lexend Light" w:eastAsia="Lexend Light" w:hAnsi="Lexend Light"/>
+        </w:rPr>
+      </w:pPr>
+      <w:r>
+        <w:t>El hero ocupa como mínimo la altura completa de la pantalla y no incluye botones ni tarjetas adicionales.</w:t>
       </w:r>
     </w:p>
     <w:p>
@@ -3844,19 +3286,8 @@
           <w:szCs w:val="26"/>
         </w:rPr>
       </w:pPr>
-      <w:bookmarkStart w:colFirst="0" w:colLast="0" w:name="_9l4pu3z1paqo" w:id="26"/>
-      <w:bookmarkEnd w:id="26"/>
-      <w:r>
-        <w:rPr>
-          <w:rFonts w:ascii="Lexend Light" w:cs="Lexend Light" w:eastAsia="Lexend Light" w:hAnsi="Lexend Light"/>
-          <w:b w:val="1"/>
-          <w:bCs w:val="1"/>
-          <w:color w:val="000000"/>
-          <w:sz w:val="26"/>
-          <w:szCs w:val="26"/>
-          <w:rtl w:val="0"/>
-        </w:rPr>
-        <w:t xml:space="preserve">Proyectos destacados</w:t>
+      <w:r>
+        <w:t>Proyectos y galerías</w:t>
       </w:r>
     </w:p>
     <w:p>
@@ -3882,11 +3313,7 @@
         </w:rPr>
       </w:pPr>
       <w:r>
-        <w:rPr>
-          <w:rFonts w:ascii="Lexend Light" w:cs="Lexend Light" w:eastAsia="Lexend Light" w:hAnsi="Lexend Light"/>
-          <w:rtl w:val="0"/>
-        </w:rPr>
-        <w:t xml:space="preserve">Cada entrada incluye como mínimo:</w:t>
+        <w:t>Cada proyecto de Brand y Motion incluye:</w:t>
       </w:r>
     </w:p>
     <w:p>
@@ -3962,11 +3389,7 @@
         </w:rPr>
       </w:pPr>
       <w:r>
-        <w:rPr>
-          <w:rFonts w:ascii="Lexend Light" w:cs="Lexend Light" w:eastAsia="Lexend Light" w:hAnsi="Lexend Light"/>
-          <w:rtl w:val="0"/>
-        </w:rPr>
-        <w:t xml:space="preserve">Imagen principal.</w:t>
+        <w:t>Galería de imágenes o video final.</w:t>
       </w:r>
     </w:p>
     <w:p>
@@ -3997,56 +3420,40 @@
         </w:rPr>
       </w:pPr>
       <w:r>
-        <w:rPr>
-          <w:rFonts w:ascii="Lexend Light" w:cs="Lexend Light" w:eastAsia="Lexend Light" w:hAnsi="Lexend Light"/>
-          <w:rtl w:val="0"/>
-        </w:rPr>
-        <w:t xml:space="preserve">Las imágenes pueden cambiar de proporción y tamaño.</w:t>
-      </w:r>
-    </w:p>
-    <w:p>
-      <w:pPr>
-        <w:spacing w:after="240" w:before="240" w:lineRule="auto"/>
-        <w:rPr>
-          <w:rFonts w:ascii="Lexend Light" w:cs="Lexend Light" w:eastAsia="Lexend Light" w:hAnsi="Lexend Light"/>
-        </w:rPr>
-      </w:pPr>
-      <w:r>
-        <w:rPr>
-          <w:rFonts w:ascii="Lexend Light" w:cs="Lexend Light" w:eastAsia="Lexend Light" w:hAnsi="Lexend Light"/>
-          <w:rtl w:val="0"/>
-        </w:rPr>
-        <w:t xml:space="preserve">Un proyecto puede utilizar una imagen a ancho completo y el siguiente una composición dividida en dos columnas.</w:t>
-      </w:r>
-    </w:p>
-    <w:p>
-      <w:pPr>
-        <w:spacing w:after="240" w:before="240" w:lineRule="auto"/>
-        <w:rPr>
-          <w:rFonts w:ascii="Lexend Light" w:cs="Lexend Light" w:eastAsia="Lexend Light" w:hAnsi="Lexend Light"/>
-        </w:rPr>
-      </w:pPr>
-      <w:r>
-        <w:rPr>
-          <w:rFonts w:ascii="Lexend Light" w:cs="Lexend Light" w:eastAsia="Lexend Light" w:hAnsi="Lexend Light"/>
-          <w:rtl w:val="0"/>
-        </w:rPr>
-        <w:t xml:space="preserve">No todos los proyectos deben convertirse en tarjetas idénticas.</w:t>
-      </w:r>
-    </w:p>
-    <w:p>
-      <w:pPr>
-        <w:spacing w:after="240" w:before="240" w:lineRule="auto"/>
-        <w:rPr>
-          <w:rFonts w:ascii="Lexend Light" w:cs="Lexend Light" w:eastAsia="Lexend Light" w:hAnsi="Lexend Light"/>
-        </w:rPr>
-      </w:pPr>
-      <w:r>
-        <w:rPr>
-          <w:rFonts w:ascii="Lexend Light" w:cs="Lexend Light" w:eastAsia="Lexend Light" w:hAnsi="Lexend Light"/>
-          <w:rtl w:val="0"/>
-        </w:rPr>
-        <w:t xml:space="preserve">La consistencia se consigue mediante tipografía, información, espaciado e interacción, no mediante repetir el mismo rectángulo.</w:t>
+        <w:t>Dentro de Brand, las imágenes conservan una proporción 3:4 y se organizan en galerías de cuatro o tres piezas.</w:t>
+      </w:r>
+    </w:p>
+    <w:p>
+      <w:pPr>
+        <w:spacing w:after="240" w:before="240" w:lineRule="auto"/>
+        <w:rPr>
+          <w:rFonts w:ascii="Lexend Light" w:cs="Lexend Light" w:eastAsia="Lexend Light" w:hAnsi="Lexend Light"/>
+        </w:rPr>
+      </w:pPr>
+      <w:r>
+        <w:t>Motion presenta dos proyectos en columnas: un video vertical y otro horizontal.</w:t>
+      </w:r>
+    </w:p>
+    <w:p>
+      <w:pPr>
+        <w:spacing w:after="240" w:before="240" w:lineRule="auto"/>
+        <w:rPr>
+          <w:rFonts w:ascii="Lexend Light" w:cs="Lexend Light" w:eastAsia="Lexend Light" w:hAnsi="Lexend Light"/>
+        </w:rPr>
+      </w:pPr>
+      <w:r>
+        <w:t>La repetición de estructura dentro de una categoría mantiene consistencia, mientras que el cambio de fondo y formato diferencia cada área.</w:t>
+      </w:r>
+    </w:p>
+    <w:p>
+      <w:pPr>
+        <w:spacing w:after="240" w:before="240" w:lineRule="auto"/>
+        <w:rPr>
+          <w:rFonts w:ascii="Lexend Light" w:cs="Lexend Light" w:eastAsia="Lexend Light" w:hAnsi="Lexend Light"/>
+        </w:rPr>
+      </w:pPr>
+      <w:r>
+        <w:t>La consistencia se construye mediante tipografía, metadatos, espaciado, radios e interacción.</w:t>
       </w:r>
     </w:p>
     <w:p>
@@ -4087,11 +3494,7 @@
         </w:rPr>
       </w:pPr>
       <w:r>
-        <w:rPr>
-          <w:rFonts w:ascii="Lexend Light" w:cs="Lexend Light" w:eastAsia="Lexend Light" w:hAnsi="Lexend Light"/>
-          <w:rtl w:val="0"/>
-        </w:rPr>
-        <w:t xml:space="preserve">Las imágenes pueden:</w:t>
+        <w:t>Las imágenes se organizan de las siguientes formas:</w:t>
       </w:r>
     </w:p>
     <w:p>
@@ -4107,11 +3510,7 @@
         </w:rPr>
       </w:pPr>
       <w:r>
-        <w:rPr>
-          <w:rFonts w:ascii="Lexend Light" w:cs="Lexend Light" w:eastAsia="Lexend Light" w:hAnsi="Lexend Light"/>
-          <w:rtl w:val="0"/>
-        </w:rPr>
-        <w:t xml:space="preserve">Ocupar todo el ancho disponible.</w:t>
+        <w:t>Tres tarjetas verticales en la vista rápida.</w:t>
       </w:r>
     </w:p>
     <w:p>
@@ -4127,11 +3526,7 @@
         </w:rPr>
       </w:pPr>
       <w:r>
-        <w:rPr>
-          <w:rFonts w:ascii="Lexend Light" w:cs="Lexend Light" w:eastAsia="Lexend Light" w:hAnsi="Lexend Light"/>
-          <w:rtl w:val="0"/>
-        </w:rPr>
-        <w:t xml:space="preserve">Utilizar media pantalla.</w:t>
+        <w:t>Galerías de cuatro o tres columnas dentro de Brand.</w:t>
       </w:r>
     </w:p>
     <w:p>
@@ -4147,11 +3542,7 @@
         </w:rPr>
       </w:pPr>
       <w:r>
-        <w:rPr>
-          <w:rFonts w:ascii="Lexend Light" w:cs="Lexend Light" w:eastAsia="Lexend Light" w:hAnsi="Lexend Light"/>
-          <w:rtl w:val="0"/>
-        </w:rPr>
-        <w:t xml:space="preserve">Aparecer en pares.</w:t>
+        <w:t>Retícula de seis ilustraciones en tres columnas.</w:t>
       </w:r>
     </w:p>
     <w:p>
@@ -4167,11 +3558,7 @@
         </w:rPr>
       </w:pPr>
       <w:r>
-        <w:rPr>
-          <w:rFonts w:ascii="Lexend Light" w:cs="Lexend Light" w:eastAsia="Lexend Light" w:hAnsi="Lexend Light"/>
-          <w:rtl w:val="0"/>
-        </w:rPr>
-        <w:t xml:space="preserve">Formar pequeñas galerías.</w:t>
+        <w:t>Vista ampliada mediante lightbox.</w:t>
       </w:r>
     </w:p>
     <w:p>
@@ -4187,11 +3574,7 @@
         </w:rPr>
       </w:pPr>
       <w:r>
-        <w:rPr>
-          <w:rFonts w:ascii="Lexend Light" w:cs="Lexend Light" w:eastAsia="Lexend Light" w:hAnsi="Lexend Light"/>
-          <w:rtl w:val="0"/>
-        </w:rPr>
-        <w:t xml:space="preserve">Alternar formatos horizontales y verticales.</w:t>
+        <w:t>Fotografía a pantalla completa en Home y composición dividida en About.</w:t>
       </w:r>
     </w:p>
     <w:p>
@@ -4207,26 +3590,18 @@
         </w:rPr>
       </w:pPr>
       <w:r>
-        <w:rPr>
-          <w:rFonts w:ascii="Lexend Light" w:cs="Lexend Light" w:eastAsia="Lexend Light" w:hAnsi="Lexend Light"/>
-          <w:rtl w:val="0"/>
-        </w:rPr>
-        <w:t xml:space="preserve">Utilizar diferentes proporciones según el proyecto.</w:t>
-      </w:r>
-    </w:p>
-    <w:p>
-      <w:pPr>
-        <w:spacing w:after="240" w:before="240" w:lineRule="auto"/>
-        <w:rPr>
-          <w:rFonts w:ascii="Lexend Light" w:cs="Lexend Light" w:eastAsia="Lexend Light" w:hAnsi="Lexend Light"/>
-        </w:rPr>
-      </w:pPr>
-      <w:r>
-        <w:rPr>
-          <w:rFonts w:ascii="Lexend Light" w:cs="Lexend Light" w:eastAsia="Lexend Light" w:hAnsi="Lexend Light"/>
-          <w:rtl w:val="0"/>
-        </w:rPr>
-        <w:t xml:space="preserve">No deben colocarse dentro de marcos innecesarios.</w:t>
+        <w:t>Proporción 3:4 en galerías y proporciones propias en los videos.</w:t>
+      </w:r>
+    </w:p>
+    <w:p>
+      <w:pPr>
+        <w:spacing w:after="240" w:before="240" w:lineRule="auto"/>
+        <w:rPr>
+          <w:rFonts w:ascii="Lexend Light" w:cs="Lexend Light" w:eastAsia="Lexend Light" w:hAnsi="Lexend Light"/>
+        </w:rPr>
+      </w:pPr>
+      <w:r>
+        <w:t>Las imágenes utilizan radios de 24px y no incorporan marcos decorativos adicionales.</w:t>
       </w:r>
     </w:p>
     <w:p>
@@ -4282,79 +3657,57 @@
         </w:rPr>
       </w:pPr>
       <w:r>
-        <w:rPr>
-          <w:rFonts w:ascii="Lexend Light" w:cs="Lexend Light" w:eastAsia="Lexend Light" w:hAnsi="Lexend Light"/>
-          <w:rtl w:val="0"/>
-        </w:rPr>
-        <w:t xml:space="preserve">Para experiencia, disciplinas, habilidades o servicios utilizo listas amplias y sencillas.</w:t>
-      </w:r>
-    </w:p>
-    <w:p>
-      <w:pPr>
-        <w:spacing w:after="240" w:before="240" w:lineRule="auto"/>
-        <w:rPr>
-          <w:rFonts w:ascii="Lexend Light" w:cs="Lexend Light" w:eastAsia="Lexend Light" w:hAnsi="Lexend Light"/>
-        </w:rPr>
-      </w:pPr>
-      <w:r>
-        <w:rPr>
-          <w:rFonts w:ascii="Lexend Light" w:cs="Lexend Light" w:eastAsia="Lexend Light" w:hAnsi="Lexend Light"/>
-          <w:rtl w:val="0"/>
-        </w:rPr>
-        <w:t xml:space="preserve">Cada elemento puede estar separado mediante una línea horizontal e incluir una numeración:</w:t>
-      </w:r>
-    </w:p>
-    <w:p>
-      <w:pPr>
-        <w:spacing w:after="240" w:before="240" w:lineRule="auto"/>
-        <w:rPr>
-          <w:rFonts w:ascii="Lexend Light" w:cs="Lexend Light" w:eastAsia="Lexend Light" w:hAnsi="Lexend Light"/>
-          <w:b w:val="1"/>
-          <w:bCs w:val="1"/>
-        </w:rPr>
-      </w:pPr>
-      <w:r>
-        <w:rPr>
-          <w:rFonts w:ascii="Lexend Light" w:cs="Lexend Light" w:eastAsia="Lexend Light" w:hAnsi="Lexend Light"/>
-          <w:b w:val="1"/>
-          <w:bCs w:val="1"/>
-          <w:rtl w:val="0"/>
-        </w:rPr>
-        <w:t xml:space="preserve">01 — Branding</w:t>
-        <w:br w:type="textWrapping"/>
-        <w:t xml:space="preserve">02 — Editorial</w:t>
-        <w:br w:type="textWrapping"/>
-        <w:t xml:space="preserve">03 — UX/UI</w:t>
-      </w:r>
-    </w:p>
-    <w:p>
-      <w:pPr>
-        <w:spacing w:after="240" w:before="240" w:lineRule="auto"/>
-        <w:rPr>
-          <w:rFonts w:ascii="Lexend Light" w:cs="Lexend Light" w:eastAsia="Lexend Light" w:hAnsi="Lexend Light"/>
-        </w:rPr>
-      </w:pPr>
-      <w:r>
-        <w:rPr>
-          <w:rFonts w:ascii="Lexend Light" w:cs="Lexend Light" w:eastAsia="Lexend Light" w:hAnsi="Lexend Light"/>
-          <w:rtl w:val="0"/>
-        </w:rPr>
-        <w:t xml:space="preserve">Los números pueden utilizar Franie Bold y los títulos Basori o Franie Bold dependiendo de la jerarquía.</w:t>
-      </w:r>
-    </w:p>
-    <w:p>
-      <w:pPr>
-        <w:spacing w:after="240" w:before="240" w:lineRule="auto"/>
-        <w:rPr>
-          <w:rFonts w:ascii="Lexend Light" w:cs="Lexend Light" w:eastAsia="Lexend Light" w:hAnsi="Lexend Light"/>
-        </w:rPr>
-      </w:pPr>
-      <w:r>
-        <w:rPr>
-          <w:rFonts w:ascii="Lexend Light" w:cs="Lexend Light" w:eastAsia="Lexend Light" w:hAnsi="Lexend Light"/>
-          <w:rtl w:val="0"/>
-        </w:rPr>
-        <w:t xml:space="preserve">En hover, el elemento puede cambiar de color o revelar una imagen relacionada.</w:t>
+        <w:t>Los listados se utilizan principalmente en el menú “Lo que hago”, la navegación y la organización de proyectos.</w:t>
+      </w:r>
+    </w:p>
+    <w:p>
+      <w:pPr>
+        <w:spacing w:after="240" w:before="240" w:lineRule="auto"/>
+        <w:rPr>
+          <w:rFonts w:ascii="Lexend Light" w:cs="Lexend Light" w:eastAsia="Lexend Light" w:hAnsi="Lexend Light"/>
+        </w:rPr>
+      </w:pPr>
+      <w:r>
+        <w:t>Cada elemento puede estar separado mediante una línea horizontal, una numeración o un símbolo “+”.</w:t>
+      </w:r>
+    </w:p>
+    <w:p>
+      <w:pPr>
+        <w:spacing w:after="240" w:before="240" w:lineRule="auto"/>
+        <w:rPr>
+          <w:rFonts w:ascii="Lexend Light" w:cs="Lexend Light" w:eastAsia="Lexend Light" w:hAnsi="Lexend Light"/>
+          <w:b w:val="1"/>
+          <w:bCs w:val="1"/>
+        </w:rPr>
+      </w:pPr>
+      <w:r>
+        <w:t>Brand +</w:t>
+        <w:br/>
+        <w:t>Motion +</w:t>
+        <w:br/>
+        <w:t>Illustration +</w:t>
+      </w:r>
+    </w:p>
+    <w:p>
+      <w:pPr>
+        <w:spacing w:after="240" w:before="240" w:lineRule="auto"/>
+        <w:rPr>
+          <w:rFonts w:ascii="Lexend Light" w:cs="Lexend Light" w:eastAsia="Lexend Light" w:hAnsi="Lexend Light"/>
+        </w:rPr>
+      </w:pPr>
+      <w:r>
+        <w:t>Los números utilizan Franie Bold y los títulos pueden utilizar ITTrivane o Franie Bold según su función.</w:t>
+      </w:r>
+    </w:p>
+    <w:p>
+      <w:pPr>
+        <w:spacing w:after="240" w:before="240" w:lineRule="auto"/>
+        <w:rPr>
+          <w:rFonts w:ascii="Lexend Light" w:cs="Lexend Light" w:eastAsia="Lexend Light" w:hAnsi="Lexend Light"/>
+        </w:rPr>
+      </w:pPr>
+      <w:r>
+        <w:t>En hover, los elementos cambian a rosa y se desplazan ligeramente.</w:t>
       </w:r>
     </w:p>
     <w:p>
@@ -4490,11 +3843,7 @@
         </w:rPr>
       </w:pPr>
       <w:r>
-        <w:rPr>
-          <w:rFonts w:ascii="Lexend Light" w:cs="Lexend Light" w:eastAsia="Lexend Light" w:hAnsi="Lexend Light"/>
-          <w:rtl w:val="0"/>
-        </w:rPr>
-        <w:t xml:space="preserve">Procesos.</w:t>
+        <w:t>Menú “Lo que hago”.</w:t>
       </w:r>
     </w:p>
     <w:p>
@@ -4510,11 +3859,7 @@
         </w:rPr>
       </w:pPr>
       <w:r>
-        <w:rPr>
-          <w:rFonts w:ascii="Lexend Light" w:cs="Lexend Light" w:eastAsia="Lexend Light" w:hAnsi="Lexend Light"/>
-          <w:rtl w:val="0"/>
-        </w:rPr>
-        <w:t xml:space="preserve">Categorías.</w:t>
+        <w:t>Categorías y listados editoriales.</w:t>
       </w:r>
     </w:p>
     <w:p>
@@ -4530,11 +3875,7 @@
         </w:rPr>
       </w:pPr>
       <w:r>
-        <w:rPr>
-          <w:rFonts w:ascii="Lexend Light" w:cs="Lexend Light" w:eastAsia="Lexend Light" w:hAnsi="Lexend Light"/>
-          <w:rtl w:val="0"/>
-        </w:rPr>
-        <w:t xml:space="preserve">Secciones.</w:t>
+        <w:t>Secciones puntuales.</w:t>
       </w:r>
     </w:p>
     <w:p>
@@ -4680,26 +4021,18 @@
         </w:rPr>
       </w:pPr>
       <w:r>
-        <w:rPr>
-          <w:rFonts w:ascii="Lexend Light" w:cs="Lexend Light" w:eastAsia="Lexend Light" w:hAnsi="Lexend Light"/>
-          <w:rtl w:val="0"/>
-        </w:rPr>
-        <w:t xml:space="preserve">Pueden utilizarse líneas de texto repetitivo o movimiento horizontal para generar transiciones entre secciones.</w:t>
-      </w:r>
-    </w:p>
-    <w:p>
-      <w:pPr>
-        <w:spacing w:after="240" w:before="240" w:lineRule="auto"/>
-        <w:rPr>
-          <w:rFonts w:ascii="Lexend Light" w:cs="Lexend Light" w:eastAsia="Lexend Light" w:hAnsi="Lexend Light"/>
-        </w:rPr>
-      </w:pPr>
-      <w:r>
-        <w:rPr>
-          <w:rFonts w:ascii="Lexend Light" w:cs="Lexend Light" w:eastAsia="Lexend Light" w:hAnsi="Lexend Light"/>
-          <w:rtl w:val="0"/>
-        </w:rPr>
-        <w:t xml:space="preserve">Las marquesinas pueden incluir:</w:t>
+        <w:t>La marquesina utiliza texto repetitivo y movimiento horizontal como transición antes de Contact.</w:t>
+      </w:r>
+    </w:p>
+    <w:p>
+      <w:pPr>
+        <w:spacing w:after="240" w:before="240" w:lineRule="auto"/>
+        <w:rPr>
+          <w:rFonts w:ascii="Lexend Light" w:cs="Lexend Light" w:eastAsia="Lexend Light" w:hAnsi="Lexend Light"/>
+        </w:rPr>
+      </w:pPr>
+      <w:r>
+        <w:t>Incluye tres frases:</w:t>
       </w:r>
     </w:p>
     <w:p>
@@ -4715,11 +4048,7 @@
         </w:rPr>
       </w:pPr>
       <w:r>
-        <w:rPr>
-          <w:rFonts w:ascii="Lexend Light" w:cs="Lexend Light" w:eastAsia="Lexend Light" w:hAnsi="Lexend Light"/>
-          <w:rtl w:val="0"/>
-        </w:rPr>
-        <w:t xml:space="preserve">Disciplinas.</w:t>
+        <w:t>MAKE IT BOLD.</w:t>
       </w:r>
     </w:p>
     <w:p>
@@ -4735,11 +4064,7 @@
         </w:rPr>
       </w:pPr>
       <w:r>
-        <w:rPr>
-          <w:rFonts w:ascii="Lexend Light" w:cs="Lexend Light" w:eastAsia="Lexend Light" w:hAnsi="Lexend Light"/>
-          <w:rtl w:val="0"/>
-        </w:rPr>
-        <w:t xml:space="preserve">Frases.</w:t>
+        <w:t>MAKE IT MOVE.</w:t>
       </w:r>
     </w:p>
     <w:p>
@@ -4755,11 +4080,7 @@
         </w:rPr>
       </w:pPr>
       <w:r>
-        <w:rPr>
-          <w:rFonts w:ascii="Lexend Light" w:cs="Lexend Light" w:eastAsia="Lexend Light" w:hAnsi="Lexend Light"/>
-          <w:rtl w:val="0"/>
-        </w:rPr>
-        <w:t xml:space="preserve">Palabras clave.</w:t>
+        <w:t>MAKE IT YOURS.</w:t>
       </w:r>
     </w:p>
     <w:p>
@@ -4775,11 +4096,7 @@
         </w:rPr>
       </w:pPr>
       <w:r>
-        <w:rPr>
-          <w:rFonts w:ascii="Lexend Light" w:cs="Lexend Light" w:eastAsia="Lexend Light" w:hAnsi="Lexend Light"/>
-          <w:rtl w:val="0"/>
-        </w:rPr>
-        <w:t xml:space="preserve">Nombre de la marca.</w:t>
+        <w:t>Las frases alternan mayúsculas, minúsculas y pesos de Franie.</w:t>
       </w:r>
     </w:p>
     <w:p>
@@ -4795,41 +4112,29 @@
         </w:rPr>
       </w:pPr>
       <w:r>
-        <w:rPr>
-          <w:rFonts w:ascii="Lexend Light" w:cs="Lexend Light" w:eastAsia="Lexend Light" w:hAnsi="Lexend Light"/>
-          <w:rtl w:val="0"/>
-        </w:rPr>
-        <w:t xml:space="preserve">Invitaciones a explorar el trabajo.</w:t>
-      </w:r>
-    </w:p>
-    <w:p>
-      <w:pPr>
-        <w:spacing w:after="240" w:before="240" w:lineRule="auto"/>
-        <w:rPr>
-          <w:rFonts w:ascii="Lexend Light" w:cs="Lexend Light" w:eastAsia="Lexend Light" w:hAnsi="Lexend Light"/>
-        </w:rPr>
-      </w:pPr>
-      <w:r>
-        <w:rPr>
-          <w:rFonts w:ascii="Lexend Light" w:cs="Lexend Light" w:eastAsia="Lexend Light" w:hAnsi="Lexend Light"/>
-          <w:rtl w:val="0"/>
-        </w:rPr>
-        <w:t xml:space="preserve">Se utilizan Basori o Franie Bold.</w:t>
-      </w:r>
-    </w:p>
-    <w:p>
-      <w:pPr>
-        <w:spacing w:after="240" w:before="240" w:lineRule="auto"/>
-        <w:rPr>
-          <w:rFonts w:ascii="Lexend Light" w:cs="Lexend Light" w:eastAsia="Lexend Light" w:hAnsi="Lexend Light"/>
-        </w:rPr>
-      </w:pPr>
-      <w:r>
-        <w:rPr>
-          <w:rFonts w:ascii="Lexend Light" w:cs="Lexend Light" w:eastAsia="Lexend Light" w:hAnsi="Lexend Light"/>
-          <w:rtl w:val="0"/>
-        </w:rPr>
-        <w:t xml:space="preserve">No aparecen constantemente: funcionan como momentos puntuales dentro del recorrido.</w:t>
+        <w:t>El movimiento es continuo, decorativo y no contiene información esencial.</w:t>
+      </w:r>
+    </w:p>
+    <w:p>
+      <w:pPr>
+        <w:spacing w:after="240" w:before="240" w:lineRule="auto"/>
+        <w:rPr>
+          <w:rFonts w:ascii="Lexend Light" w:cs="Lexend Light" w:eastAsia="Lexend Light" w:hAnsi="Lexend Light"/>
+        </w:rPr>
+      </w:pPr>
+      <w:r>
+        <w:t>Se utiliza Franie Bold y Franie Regular.</w:t>
+      </w:r>
+    </w:p>
+    <w:p>
+      <w:pPr>
+        <w:spacing w:after="240" w:before="240" w:lineRule="auto"/>
+        <w:rPr>
+          <w:rFonts w:ascii="Lexend Light" w:cs="Lexend Light" w:eastAsia="Lexend Light" w:hAnsi="Lexend Light"/>
+        </w:rPr>
+      </w:pPr>
+      <w:r>
+        <w:t>Aparece una sola vez como transición entre Illustration y Contact.</w:t>
       </w:r>
     </w:p>
     <w:p>
@@ -4847,49 +4152,30 @@
           <w:szCs w:val="26"/>
         </w:rPr>
       </w:pPr>
-      <w:bookmarkStart w:colFirst="0" w:colLast="0" w:name="_78pa1uemfxv3" w:id="32"/>
-      <w:bookmarkEnd w:id="32"/>
-      <w:r>
-        <w:rPr>
-          <w:rFonts w:ascii="Lexend Light" w:cs="Lexend Light" w:eastAsia="Lexend Light" w:hAnsi="Lexend Light"/>
-          <w:b w:val="1"/>
-          <w:bCs w:val="1"/>
-          <w:color w:val="000000"/>
-          <w:sz w:val="26"/>
-          <w:szCs w:val="26"/>
-          <w:rtl w:val="0"/>
-        </w:rPr>
-        <w:t xml:space="preserve">Página de proyecto</w:t>
-      </w:r>
-    </w:p>
-    <w:p>
-      <w:pPr>
-        <w:spacing w:after="240" w:before="240" w:lineRule="auto"/>
-        <w:rPr>
-          <w:rFonts w:ascii="Lexend Light" w:cs="Lexend Light" w:eastAsia="Lexend Light" w:hAnsi="Lexend Light"/>
-        </w:rPr>
-      </w:pPr>
-      <w:r>
-        <w:rPr>
-          <w:rFonts w:ascii="Lexend Light" w:cs="Lexend Light" w:eastAsia="Lexend Light" w:hAnsi="Lexend Light"/>
-          <w:rtl w:val="0"/>
-        </w:rPr>
-        <w:t xml:space="preserve">Cada proyecto puede adaptar ligeramente su estructura al contenido.</w:t>
-      </w:r>
-    </w:p>
-    <w:p>
-      <w:pPr>
-        <w:spacing w:after="240" w:before="240" w:lineRule="auto"/>
-        <w:rPr>
-          <w:rFonts w:ascii="Lexend Light" w:cs="Lexend Light" w:eastAsia="Lexend Light" w:hAnsi="Lexend Light"/>
-        </w:rPr>
-      </w:pPr>
-      <w:r>
-        <w:rPr>
-          <w:rFonts w:ascii="Lexend Light" w:cs="Lexend Light" w:eastAsia="Lexend Light" w:hAnsi="Lexend Light"/>
-          <w:rtl w:val="0"/>
-        </w:rPr>
-        <w:t xml:space="preserve">La introducción incluye:</w:t>
+      <w:r>
+        <w:t>Lightbox y bloques de proyecto</w:t>
+      </w:r>
+    </w:p>
+    <w:p>
+      <w:pPr>
+        <w:spacing w:after="240" w:before="240" w:lineRule="auto"/>
+        <w:rPr>
+          <w:rFonts w:ascii="Lexend Light" w:cs="Lexend Light" w:eastAsia="Lexend Light" w:hAnsi="Lexend Light"/>
+        </w:rPr>
+      </w:pPr>
+      <w:r>
+        <w:t>No existen páginas individuales de proyecto. Brand, Motion e Illustration permanecen dentro de la misma landing.</w:t>
+      </w:r>
+    </w:p>
+    <w:p>
+      <w:pPr>
+        <w:spacing w:after="240" w:before="240" w:lineRule="auto"/>
+        <w:rPr>
+          <w:rFonts w:ascii="Lexend Light" w:cs="Lexend Light" w:eastAsia="Lexend Light" w:hAnsi="Lexend Light"/>
+        </w:rPr>
+      </w:pPr>
+      <w:r>
+        <w:t>Los bloques de Brand y Motion incluyen:</w:t>
       </w:r>
     </w:p>
     <w:p>
@@ -5000,41 +4286,29 @@
         </w:rPr>
       </w:pPr>
       <w:r>
-        <w:rPr>
-          <w:rFonts w:ascii="Lexend Light" w:cs="Lexend Light" w:eastAsia="Lexend Light" w:hAnsi="Lexend Light"/>
-          <w:rtl w:val="0"/>
-        </w:rPr>
-        <w:t xml:space="preserve">Después se prioriza la presentación visual mediante imágenes grandes, videos, detalles, mockups y composiciones editoriales.</w:t>
-      </w:r>
-    </w:p>
-    <w:p>
-      <w:pPr>
-        <w:spacing w:after="240" w:before="240" w:lineRule="auto"/>
-        <w:rPr>
-          <w:rFonts w:ascii="Lexend Light" w:cs="Lexend Light" w:eastAsia="Lexend Light" w:hAnsi="Lexend Light"/>
-        </w:rPr>
-      </w:pPr>
-      <w:r>
-        <w:rPr>
-          <w:rFonts w:ascii="Lexend Light" w:cs="Lexend Light" w:eastAsia="Lexend Light" w:hAnsi="Lexend Light"/>
-          <w:rtl w:val="0"/>
-        </w:rPr>
-        <w:t xml:space="preserve">Los textos largos se mantienen en columnas más estrechas para conservar legibilidad.</w:t>
-      </w:r>
-    </w:p>
-    <w:p>
-      <w:pPr>
-        <w:spacing w:after="240" w:before="240" w:lineRule="auto"/>
-        <w:rPr>
-          <w:rFonts w:ascii="Lexend Light" w:cs="Lexend Light" w:eastAsia="Lexend Light" w:hAnsi="Lexend Light"/>
-        </w:rPr>
-      </w:pPr>
-      <w:r>
-        <w:rPr>
-          <w:rFonts w:ascii="Lexend Light" w:cs="Lexend Light" w:eastAsia="Lexend Light" w:hAnsi="Lexend Light"/>
-          <w:rtl w:val="0"/>
-        </w:rPr>
-        <w:t xml:space="preserve">La página puede alternar imágenes a pantalla completa con grupos más pequeños para generar ritmo.</w:t>
+        <w:t>El contenido visual se presenta mediante galerías, videos, mockups y piezas finales.</w:t>
+      </w:r>
+    </w:p>
+    <w:p>
+      <w:pPr>
+        <w:spacing w:after="240" w:before="240" w:lineRule="auto"/>
+        <w:rPr>
+          <w:rFonts w:ascii="Lexend Light" w:cs="Lexend Light" w:eastAsia="Lexend Light" w:hAnsi="Lexend Light"/>
+        </w:rPr>
+      </w:pPr>
+      <w:r>
+        <w:t>Las descripciones se mantienen breves y con un ancho controlado para conservar legibilidad.</w:t>
+      </w:r>
+    </w:p>
+    <w:p>
+      <w:pPr>
+        <w:spacing w:after="240" w:before="240" w:lineRule="auto"/>
+        <w:rPr>
+          <w:rFonts w:ascii="Lexend Light" w:cs="Lexend Light" w:eastAsia="Lexend Light" w:hAnsi="Lexend Light"/>
+        </w:rPr>
+      </w:pPr>
+      <w:r>
+        <w:t>Las imágenes de Brand e Illustration pueden abrirse en un lightbox con botones anterior, siguiente y cerrar, además de navegación por teclado.</w:t>
       </w:r>
     </w:p>
     <w:p>
@@ -5075,41 +4349,29 @@
         </w:rPr>
       </w:pPr>
       <w:r>
-        <w:rPr>
-          <w:rFonts w:ascii="Lexend Light" w:cs="Lexend Light" w:eastAsia="Lexend Light" w:hAnsi="Lexend Light"/>
-          <w:rtl w:val="0"/>
-        </w:rPr>
-        <w:t xml:space="preserve">La sección About combina un titular expresivo en Basori con información más extensa en Franie.</w:t>
-      </w:r>
-    </w:p>
-    <w:p>
-      <w:pPr>
-        <w:spacing w:after="240" w:before="240" w:lineRule="auto"/>
-        <w:rPr>
-          <w:rFonts w:ascii="Lexend Light" w:cs="Lexend Light" w:eastAsia="Lexend Light" w:hAnsi="Lexend Light"/>
-        </w:rPr>
-      </w:pPr>
-      <w:r>
-        <w:rPr>
-          <w:rFonts w:ascii="Lexend Light" w:cs="Lexend Light" w:eastAsia="Lexend Light" w:hAnsi="Lexend Light"/>
-          <w:rtl w:val="0"/>
-        </w:rPr>
-        <w:t xml:space="preserve">Puede incorporar una fotografía, una presentación breve, disciplinas, experiencia y datos de contacto.</w:t>
-      </w:r>
-    </w:p>
-    <w:p>
-      <w:pPr>
-        <w:spacing w:after="240" w:before="240" w:lineRule="auto"/>
-        <w:rPr>
-          <w:rFonts w:ascii="Lexend Light" w:cs="Lexend Light" w:eastAsia="Lexend Light" w:hAnsi="Lexend Light"/>
-        </w:rPr>
-      </w:pPr>
-      <w:r>
-        <w:rPr>
-          <w:rFonts w:ascii="Lexend Light" w:cs="Lexend Light" w:eastAsia="Lexend Light" w:hAnsi="Lexend Light"/>
-          <w:rtl w:val="0"/>
-        </w:rPr>
-        <w:t xml:space="preserve">La información se organiza mediante columnas, listas y jerarquía tipográfica, evitando dividir todo en pequeñas tarjetas.</w:t>
+        <w:t>About combina un título en ITTrivane con etiquetas, fotografía personal y una tarjeta azul de texto en Franie.</w:t>
+      </w:r>
+    </w:p>
+    <w:p>
+      <w:pPr>
+        <w:spacing w:after="240" w:before="240" w:lineRule="auto"/>
+        <w:rPr>
+          <w:rFonts w:ascii="Lexend Light" w:cs="Lexend Light" w:eastAsia="Lexend Light" w:hAnsi="Lexend Light"/>
+        </w:rPr>
+      </w:pPr>
+      <w:r>
+        <w:t>Incluye una presentación breve, formación, áreas de trabajo y el CTA “Escríbeme”. Después aparece una sección independiente de Software.</w:t>
+      </w:r>
+    </w:p>
+    <w:p>
+      <w:pPr>
+        <w:spacing w:after="240" w:before="240" w:lineRule="auto"/>
+        <w:rPr>
+          <w:rFonts w:ascii="Lexend Light" w:cs="Lexend Light" w:eastAsia="Lexend Light" w:hAnsi="Lexend Light"/>
+        </w:rPr>
+      </w:pPr>
+      <w:r>
+        <w:t>La información se organiza en una composición de dos columnas y pasa a una columna en móvil.</w:t>
       </w:r>
     </w:p>
     <w:p>
@@ -5150,71 +4412,51 @@
         </w:rPr>
       </w:pPr>
       <w:r>
-        <w:rPr>
-          <w:rFonts w:ascii="Lexend Light" w:cs="Lexend Light" w:eastAsia="Lexend Light" w:hAnsi="Lexend Light"/>
-          <w:rtl w:val="0"/>
-        </w:rPr>
-        <w:t xml:space="preserve">La última sección funciona como un cierre visual fuerte.</w:t>
-      </w:r>
-    </w:p>
-    <w:p>
-      <w:pPr>
-        <w:spacing w:after="240" w:before="240" w:lineRule="auto"/>
-        <w:rPr>
-          <w:rFonts w:ascii="Lexend Light" w:cs="Lexend Light" w:eastAsia="Lexend Light" w:hAnsi="Lexend Light"/>
-        </w:rPr>
-      </w:pPr>
-      <w:r>
-        <w:rPr>
-          <w:rFonts w:ascii="Lexend Light" w:cs="Lexend Light" w:eastAsia="Lexend Light" w:hAnsi="Lexend Light"/>
-          <w:rtl w:val="0"/>
-        </w:rPr>
-        <w:t xml:space="preserve">Puede utilizar un fondo completo rosa, azul, naranja o negro y un gran titular en Basori.</w:t>
-      </w:r>
-    </w:p>
-    <w:p>
-      <w:pPr>
-        <w:spacing w:after="240" w:before="240" w:lineRule="auto"/>
-        <w:rPr>
-          <w:rFonts w:ascii="Lexend Light" w:cs="Lexend Light" w:eastAsia="Lexend Light" w:hAnsi="Lexend Light"/>
-        </w:rPr>
-      </w:pPr>
-      <w:r>
-        <w:rPr>
-          <w:rFonts w:ascii="Lexend Light" w:cs="Lexend Light" w:eastAsia="Lexend Light" w:hAnsi="Lexend Light"/>
-          <w:rtl w:val="0"/>
-        </w:rPr>
-        <w:t xml:space="preserve">La llamada a la acción debe ser directa.</w:t>
-      </w:r>
-    </w:p>
-    <w:p>
-      <w:pPr>
-        <w:spacing w:after="240" w:before="240" w:lineRule="auto"/>
-        <w:rPr>
-          <w:rFonts w:ascii="Lexend Light" w:cs="Lexend Light" w:eastAsia="Lexend Light" w:hAnsi="Lexend Light"/>
-        </w:rPr>
-      </w:pPr>
-      <w:r>
-        <w:rPr>
-          <w:rFonts w:ascii="Lexend Light" w:cs="Lexend Light" w:eastAsia="Lexend Light" w:hAnsi="Lexend Light"/>
-          <w:rtl w:val="0"/>
-        </w:rPr>
-        <w:t xml:space="preserve">Los enlaces de correo y redes utilizan Franie SemiBold.</w:t>
-      </w:r>
-    </w:p>
-    <w:p>
-      <w:pPr>
-        <w:spacing w:after="240" w:before="240" w:lineRule="auto"/>
-        <w:rPr>
-          <w:rFonts w:ascii="Lexend Light" w:cs="Lexend Light" w:eastAsia="Lexend Light" w:hAnsi="Lexend Light"/>
-        </w:rPr>
-      </w:pPr>
-      <w:r>
-        <w:rPr>
-          <w:rFonts w:ascii="Lexend Light" w:cs="Lexend Light" w:eastAsia="Lexend Light" w:hAnsi="Lexend Light"/>
-          <w:rtl w:val="0"/>
-        </w:rPr>
-        <w:t xml:space="preserve">La sección debe sentirse como una conclusión del recorrido, no como un formulario corporativo complejo.</w:t>
+        <w:t>La última sección funciona como un cierre visual claro sobre fondo beige.</w:t>
+      </w:r>
+    </w:p>
+    <w:p>
+      <w:pPr>
+        <w:spacing w:after="240" w:before="240" w:lineRule="auto"/>
+        <w:rPr>
+          <w:rFonts w:ascii="Lexend Light" w:cs="Lexend Light" w:eastAsia="Lexend Light" w:hAnsi="Lexend Light"/>
+        </w:rPr>
+      </w:pPr>
+      <w:r>
+        <w:t>Combina una ilustración personal, el título “Contacto”, un mensaje breve y cuatro enlaces sociales circulares.</w:t>
+      </w:r>
+    </w:p>
+    <w:p>
+      <w:pPr>
+        <w:spacing w:after="240" w:before="240" w:lineRule="auto"/>
+        <w:rPr>
+          <w:rFonts w:ascii="Lexend Light" w:cs="Lexend Light" w:eastAsia="Lexend Light" w:hAnsi="Lexend Light"/>
+        </w:rPr>
+      </w:pPr>
+      <w:r>
+        <w:t>La llamada a la acción es directa y no utiliza formulario.</w:t>
+      </w:r>
+    </w:p>
+    <w:p>
+      <w:pPr>
+        <w:spacing w:after="240" w:before="240" w:lineRule="auto"/>
+        <w:rPr>
+          <w:rFonts w:ascii="Lexend Light" w:cs="Lexend Light" w:eastAsia="Lexend Light" w:hAnsi="Lexend Light"/>
+        </w:rPr>
+      </w:pPr>
+      <w:r>
+        <w:t>Correo, LinkedIn, Instagram y Behance aparecen como iconos circulares interactivos.</w:t>
+      </w:r>
+    </w:p>
+    <w:p>
+      <w:pPr>
+        <w:spacing w:after="240" w:before="240" w:lineRule="auto"/>
+        <w:rPr>
+          <w:rFonts w:ascii="Lexend Light" w:cs="Lexend Light" w:eastAsia="Lexend Light" w:hAnsi="Lexend Light"/>
+        </w:rPr>
+      </w:pPr>
+      <w:r>
+        <w:t>El footer incluye “Luu García”, los seis enlaces de navegación, el isotipo y “© 2026 Luu García”.</w:t>
       </w:r>
     </w:p>
     <w:p>
@@ -5232,6 +4474,44 @@
         <w:rPr>
           <w:rtl w:val="0"/>
         </w:rPr>
+      </w:r>
+    </w:p>
+    <w:p>
+      <w:pPr>
+        <w:pStyle w:val="Heading3"/>
+      </w:pPr>
+      <w:r>
+        <w:t>Animaciones e interacción</w:t>
+      </w:r>
+    </w:p>
+    <w:p>
+      <w:pPr/>
+      <w:r>
+        <w:t>Los elementos aparecen mediante transiciones breves de opacidad y desplazamiento.</w:t>
+      </w:r>
+    </w:p>
+    <w:p>
+      <w:pPr/>
+      <w:r>
+        <w:t>Algunos títulos revelan un bloque rosa animado detrás del texto.</w:t>
+      </w:r>
+    </w:p>
+    <w:p>
+      <w:pPr/>
+      <w:r>
+        <w:t>Las tarjetas, imágenes, botones y enlaces responden con color, escala o desplazamiento.</w:t>
+      </w:r>
+    </w:p>
+    <w:p>
+      <w:pPr/>
+      <w:r>
+        <w:t>El lightbox bloquea temporalmente el scroll, permite navegación anterior y siguiente y se cierra sin cambiar de página.</w:t>
+      </w:r>
+    </w:p>
+    <w:p>
+      <w:pPr/>
+      <w:r>
+        <w:t>El movimiento nunca contiene información indispensable y respeta la preferencia de movimiento reducido.</w:t>
       </w:r>
     </w:p>
     <w:p>
@@ -5305,11 +4585,7 @@
         </w:rPr>
       </w:pPr>
       <w:r>
-        <w:rPr>
-          <w:rFonts w:ascii="Lexend Light" w:cs="Lexend Light" w:eastAsia="Lexend Light" w:hAnsi="Lexend Light"/>
-          <w:rtl w:val="0"/>
-        </w:rPr>
-        <w:t xml:space="preserve">Usa Basori para los momentos de mayor impacto.</w:t>
+        <w:t>Usa ITTrivane para títulos de secciones y proyectos.</w:t>
       </w:r>
     </w:p>
     <w:p>
@@ -5325,11 +4601,7 @@
         </w:rPr>
       </w:pPr>
       <w:r>
-        <w:rPr>
-          <w:rFonts w:ascii="Lexend Light" w:cs="Lexend Light" w:eastAsia="Lexend Light" w:hAnsi="Lexend Light"/>
-          <w:rtl w:val="0"/>
-        </w:rPr>
-        <w:t xml:space="preserve">Usa Franie para toda la información funcional.</w:t>
+        <w:t>Usa Franie para el hero, el contenido funcional y las composiciones editoriales de apoyo.</w:t>
       </w:r>
     </w:p>
     <w:p>
@@ -5425,11 +4697,7 @@
         </w:rPr>
       </w:pPr>
       <w:r>
-        <w:rPr>
-          <w:rFonts w:ascii="Lexend Light" w:cs="Lexend Light" w:eastAsia="Lexend Light" w:hAnsi="Lexend Light"/>
-          <w:rtl w:val="0"/>
-        </w:rPr>
-        <w:t xml:space="preserve">Permite que cada proyecto tenga una composición adaptada a su contenido.</w:t>
+        <w:t>Mantén una estructura consistente dentro de cada categoría y cambia el ritmo entre áreas.</w:t>
       </w:r>
     </w:p>
     <w:p>
@@ -5695,11 +4963,7 @@
         </w:rPr>
       </w:pPr>
       <w:r>
-        <w:rPr>
-          <w:rFonts w:ascii="Lexend Light" w:cs="Lexend Light" w:eastAsia="Lexend Light" w:hAnsi="Lexend Light"/>
-          <w:rtl w:val="0"/>
-        </w:rPr>
-        <w:t xml:space="preserve">No conviertas todos los proyectos en tarjetas iguales.</w:t>
+        <w:t>No conviertas toda la landing en una única retícula repetida.</w:t>
       </w:r>
     </w:p>
     <w:p>
@@ -5815,11 +5079,7 @@
         </w:rPr>
       </w:pPr>
       <w:r>
-        <w:rPr>
-          <w:rFonts w:ascii="Lexend Light" w:cs="Lexend Light" w:eastAsia="Lexend Light" w:hAnsi="Lexend Light"/>
-          <w:rtl w:val="0"/>
-        </w:rPr>
-        <w:t xml:space="preserve">No utilices demasiados radios diferentes.</w:t>
+        <w:t>No utilices radios fuera del sistema de 24px, 32px, 999px y 50%.</w:t>
       </w:r>
     </w:p>
     <w:p>
@@ -5835,11 +5095,7 @@
         </w:rPr>
       </w:pPr>
       <w:r>
-        <w:rPr>
-          <w:rFonts w:ascii="Lexend Light" w:cs="Lexend Light" w:eastAsia="Lexend Light" w:hAnsi="Lexend Light"/>
-          <w:rtl w:val="0"/>
-        </w:rPr>
-        <w:t xml:space="preserve">No uses Basori en textos largos.</w:t>
+        <w:t>No uses ITTrivane en textos largos.</w:t>
       </w:r>
     </w:p>
     <w:p>
@@ -5855,11 +5111,7 @@
         </w:rPr>
       </w:pPr>
       <w:r>
-        <w:rPr>
-          <w:rFonts w:ascii="Lexend Light" w:cs="Lexend Light" w:eastAsia="Lexend Light" w:hAnsi="Lexend Light"/>
-          <w:rtl w:val="0"/>
-        </w:rPr>
-        <w:t xml:space="preserve">No utilices todos los pesos disponibles de Franie.</w:t>
+        <w:t>No incorpores pesos de Franie que no tengan una función definida.</w:t>
       </w:r>
     </w:p>
     <w:p>
@@ -6071,71 +5323,51 @@
         </w:rPr>
       </w:pPr>
       <w:r>
-        <w:rPr>
-          <w:rFonts w:ascii="Lexend Light" w:cs="Lexend Light" w:eastAsia="Lexend Light" w:hAnsi="Lexend Light"/>
-          <w:rtl w:val="0"/>
-        </w:rPr>
-        <w:t xml:space="preserve">Utilizo una retícula de 4 columnas y márgenes de 16px.</w:t>
-      </w:r>
-    </w:p>
-    <w:p>
-      <w:pPr>
-        <w:spacing w:after="240" w:before="240" w:lineRule="auto"/>
-        <w:rPr>
-          <w:rFonts w:ascii="Lexend Light" w:cs="Lexend Light" w:eastAsia="Lexend Light" w:hAnsi="Lexend Light"/>
-        </w:rPr>
-      </w:pPr>
-      <w:r>
-        <w:rPr>
-          <w:rFonts w:ascii="Lexend Light" w:cs="Lexend Light" w:eastAsia="Lexend Light" w:hAnsi="Lexend Light"/>
-          <w:rtl w:val="0"/>
-        </w:rPr>
-        <w:t xml:space="preserve">Las secciones se separan aproximadamente entre 64 y 96px.</w:t>
-      </w:r>
-    </w:p>
-    <w:p>
-      <w:pPr>
-        <w:spacing w:after="240" w:before="240" w:lineRule="auto"/>
-        <w:rPr>
-          <w:rFonts w:ascii="Lexend Light" w:cs="Lexend Light" w:eastAsia="Lexend Light" w:hAnsi="Lexend Light"/>
-        </w:rPr>
-      </w:pPr>
-      <w:r>
-        <w:rPr>
-          <w:rFonts w:ascii="Lexend Light" w:cs="Lexend Light" w:eastAsia="Lexend Light" w:hAnsi="Lexend Light"/>
-          <w:rtl w:val="0"/>
-        </w:rPr>
-        <w:t xml:space="preserve">Los títulos display bajan a aproximadamente 48–64px.</w:t>
-      </w:r>
-    </w:p>
-    <w:p>
-      <w:pPr>
-        <w:spacing w:after="240" w:before="240" w:lineRule="auto"/>
-        <w:rPr>
-          <w:rFonts w:ascii="Lexend Light" w:cs="Lexend Light" w:eastAsia="Lexend Light" w:hAnsi="Lexend Light"/>
-        </w:rPr>
-      </w:pPr>
-      <w:r>
-        <w:rPr>
-          <w:rFonts w:ascii="Lexend Light" w:cs="Lexend Light" w:eastAsia="Lexend Light" w:hAnsi="Lexend Light"/>
-          <w:rtl w:val="0"/>
-        </w:rPr>
-        <w:t xml:space="preserve">El cuerpo se mantiene entre 16 y 18px.</w:t>
-      </w:r>
-    </w:p>
-    <w:p>
-      <w:pPr>
-        <w:spacing w:after="240" w:before="240" w:lineRule="auto"/>
-        <w:rPr>
-          <w:rFonts w:ascii="Lexend Light" w:cs="Lexend Light" w:eastAsia="Lexend Light" w:hAnsi="Lexend Light"/>
-        </w:rPr>
-      </w:pPr>
-      <w:r>
-        <w:rPr>
-          <w:rFonts w:ascii="Lexend Light" w:cs="Lexend Light" w:eastAsia="Lexend Light" w:hAnsi="Lexend Light"/>
-          <w:rtl w:val="0"/>
-        </w:rPr>
-        <w:t xml:space="preserve">Las composiciones de varias columnas pasan normalmente a una sola columna.</w:t>
+        <w:t>Utilizo márgenes laterales de 16px y composiciones principalmente de una columna.</w:t>
+      </w:r>
+    </w:p>
+    <w:p>
+      <w:pPr>
+        <w:spacing w:after="240" w:before="240" w:lineRule="auto"/>
+        <w:rPr>
+          <w:rFonts w:ascii="Lexend Light" w:cs="Lexend Light" w:eastAsia="Lexend Light" w:hAnsi="Lexend Light"/>
+        </w:rPr>
+      </w:pPr>
+      <w:r>
+        <w:t>Las secciones se separan aproximadamente entre 64 y 96px.</w:t>
+      </w:r>
+    </w:p>
+    <w:p>
+      <w:pPr>
+        <w:spacing w:after="240" w:before="240" w:lineRule="auto"/>
+        <w:rPr>
+          <w:rFonts w:ascii="Lexend Light" w:cs="Lexend Light" w:eastAsia="Lexend Light" w:hAnsi="Lexend Light"/>
+        </w:rPr>
+      </w:pPr>
+      <w:r>
+        <w:t>Los títulos principales bajan aproximadamente a 36–64px; el nombre del hero se mantiene entre 64px y una escala fluida.</w:t>
+      </w:r>
+    </w:p>
+    <w:p>
+      <w:pPr>
+        <w:spacing w:after="240" w:before="240" w:lineRule="auto"/>
+        <w:rPr>
+          <w:rFonts w:ascii="Lexend Light" w:cs="Lexend Light" w:eastAsia="Lexend Light" w:hAnsi="Lexend Light"/>
+        </w:rPr>
+      </w:pPr>
+      <w:r>
+        <w:t>El cuerpo se mantiene entre 14 y 16px.</w:t>
+      </w:r>
+    </w:p>
+    <w:p>
+      <w:pPr>
+        <w:spacing w:after="240" w:before="240" w:lineRule="auto"/>
+        <w:rPr>
+          <w:rFonts w:ascii="Lexend Light" w:cs="Lexend Light" w:eastAsia="Lexend Light" w:hAnsi="Lexend Light"/>
+        </w:rPr>
+      </w:pPr>
+      <w:r>
+        <w:t>Las composiciones de varias columnas pasan normalmente a una columna; algunas galerías pueden conservar dos.</w:t>
       </w:r>
     </w:p>
     <w:p>
@@ -6221,26 +5453,18 @@
         </w:rPr>
       </w:pPr>
       <w:r>
-        <w:rPr>
-          <w:rFonts w:ascii="Lexend Light" w:cs="Lexend Light" w:eastAsia="Lexend Light" w:hAnsi="Lexend Light"/>
-          <w:rtl w:val="0"/>
-        </w:rPr>
-        <w:t xml:space="preserve">Utilizo una retícula de 8 columnas y márgenes de 32–48px.</w:t>
-      </w:r>
-    </w:p>
-    <w:p>
-      <w:pPr>
-        <w:spacing w:after="240" w:before="240" w:lineRule="auto"/>
-        <w:rPr>
-          <w:rFonts w:ascii="Lexend Light" w:cs="Lexend Light" w:eastAsia="Lexend Light" w:hAnsi="Lexend Light"/>
-        </w:rPr>
-      </w:pPr>
-      <w:r>
-        <w:rPr>
-          <w:rFonts w:ascii="Lexend Light" w:cs="Lexend Light" w:eastAsia="Lexend Light" w:hAnsi="Lexend Light"/>
-          <w:rtl w:val="0"/>
-        </w:rPr>
-        <w:t xml:space="preserve">Los títulos principales se sitúan aproximadamente entre 64 y 80px.</w:t>
+        <w:t>Utilizo márgenes laterales de 32px.</w:t>
+      </w:r>
+    </w:p>
+    <w:p>
+      <w:pPr>
+        <w:spacing w:after="240" w:before="240" w:lineRule="auto"/>
+        <w:rPr>
+          <w:rFonts w:ascii="Lexend Light" w:cs="Lexend Light" w:eastAsia="Lexend Light" w:hAnsi="Lexend Light"/>
+        </w:rPr>
+      </w:pPr>
+      <w:r>
+        <w:t>Los títulos principales se sitúan aproximadamente entre 44 y 80px.</w:t>
       </w:r>
     </w:p>
     <w:p>
@@ -6266,11 +5490,7 @@
         </w:rPr>
       </w:pPr>
       <w:r>
-        <w:rPr>
-          <w:rFonts w:ascii="Lexend Light" w:cs="Lexend Light" w:eastAsia="Lexend Light" w:hAnsi="Lexend Light"/>
-          <w:rtl w:val="0"/>
-        </w:rPr>
-        <w:t xml:space="preserve">Las galerías pueden utilizar dos columnas.</w:t>
+        <w:t>Las galerías utilizan dos o tres columnas según su contenido.</w:t>
       </w:r>
     </w:p>
     <w:p>
@@ -6311,26 +5531,18 @@
         </w:rPr>
       </w:pPr>
       <w:r>
-        <w:rPr>
-          <w:rFonts w:ascii="Lexend Light" w:cs="Lexend Light" w:eastAsia="Lexend Light" w:hAnsi="Lexend Light"/>
-          <w:rtl w:val="0"/>
-        </w:rPr>
-        <w:t xml:space="preserve">Utilizo una retícula de 12 columnas y márgenes de 48–64px.</w:t>
-      </w:r>
-    </w:p>
-    <w:p>
-      <w:pPr>
-        <w:spacing w:after="240" w:before="240" w:lineRule="auto"/>
-        <w:rPr>
-          <w:rFonts w:ascii="Lexend Light" w:cs="Lexend Light" w:eastAsia="Lexend Light" w:hAnsi="Lexend Light"/>
-        </w:rPr>
-      </w:pPr>
-      <w:r>
-        <w:rPr>
-          <w:rFonts w:ascii="Lexend Light" w:cs="Lexend Light" w:eastAsia="Lexend Light" w:hAnsi="Lexend Light"/>
-          <w:rtl w:val="0"/>
-        </w:rPr>
-        <w:t xml:space="preserve">Los títulos pueden alcanzar entre 80 y 112px.</w:t>
+        <w:t>Utilizo márgenes laterales de 48px y un ancho máximo de contenido de 1600px.</w:t>
+      </w:r>
+    </w:p>
+    <w:p>
+      <w:pPr>
+        <w:spacing w:after="240" w:before="240" w:lineRule="auto"/>
+        <w:rPr>
+          <w:rFonts w:ascii="Lexend Light" w:cs="Lexend Light" w:eastAsia="Lexend Light" w:hAnsi="Lexend Light"/>
+        </w:rPr>
+      </w:pPr>
+      <w:r>
+        <w:t>Los títulos principales alcanzan aproximadamente entre 56 y 120px; el hero puede crecer más mediante escala fluida.</w:t>
       </w:r>
     </w:p>
     <w:p>
@@ -6401,41 +5613,29 @@
         </w:rPr>
       </w:pPr>
       <w:r>
-        <w:rPr>
-          <w:rFonts w:ascii="Lexend Light" w:cs="Lexend Light" w:eastAsia="Lexend Light" w:hAnsi="Lexend Light"/>
-          <w:rtl w:val="0"/>
-        </w:rPr>
-        <w:t xml:space="preserve">El contenido se limita a un ancho aproximado de 1600px y se centra.</w:t>
-      </w:r>
-    </w:p>
-    <w:p>
-      <w:pPr>
-        <w:spacing w:after="240" w:before="240" w:lineRule="auto"/>
-        <w:rPr>
-          <w:rFonts w:ascii="Lexend Light" w:cs="Lexend Light" w:eastAsia="Lexend Light" w:hAnsi="Lexend Light"/>
-        </w:rPr>
-      </w:pPr>
-      <w:r>
-        <w:rPr>
-          <w:rFonts w:ascii="Lexend Light" w:cs="Lexend Light" w:eastAsia="Lexend Light" w:hAnsi="Lexend Light"/>
-          <w:rtl w:val="0"/>
-        </w:rPr>
-        <w:t xml:space="preserve">Los títulos display pueden alcanzar los 128px.</w:t>
-      </w:r>
-    </w:p>
-    <w:p>
-      <w:pPr>
-        <w:spacing w:after="240" w:before="240" w:lineRule="auto"/>
-        <w:rPr>
-          <w:rFonts w:ascii="Lexend Light" w:cs="Lexend Light" w:eastAsia="Lexend Light" w:hAnsi="Lexend Light"/>
-        </w:rPr>
-      </w:pPr>
-      <w:r>
-        <w:rPr>
-          <w:rFonts w:ascii="Lexend Light" w:cs="Lexend Light" w:eastAsia="Lexend Light" w:hAnsi="Lexend Light"/>
-          <w:rtl w:val="0"/>
-        </w:rPr>
-        <w:t xml:space="preserve">Las secciones pueden utilizar separaciones de hasta 160px.</w:t>
+        <w:t>El contenido se limita a 1600px, se centra y utiliza márgenes laterales de 64px.</w:t>
+      </w:r>
+    </w:p>
+    <w:p>
+      <w:pPr>
+        <w:spacing w:after="240" w:before="240" w:lineRule="auto"/>
+        <w:rPr>
+          <w:rFonts w:ascii="Lexend Light" w:cs="Lexend Light" w:eastAsia="Lexend Light" w:hAnsi="Lexend Light"/>
+        </w:rPr>
+      </w:pPr>
+      <w:r>
+        <w:t>Los títulos editoriales pueden alcanzar 120px y el nombre del hero hasta 180px.</w:t>
+      </w:r>
+    </w:p>
+    <w:p>
+      <w:pPr>
+        <w:spacing w:after="240" w:before="240" w:lineRule="auto"/>
+        <w:rPr>
+          <w:rFonts w:ascii="Lexend Light" w:cs="Lexend Light" w:eastAsia="Lexend Light" w:hAnsi="Lexend Light"/>
+        </w:rPr>
+      </w:pPr>
+      <w:r>
+        <w:t>Las secciones utilizan separaciones de hasta 128px.</w:t>
       </w:r>
     </w:p>
     <w:p>
@@ -6703,18 +5903,6 @@
           <w:rtl w:val="0"/>
         </w:rPr>
         <w:t xml:space="preserve">, pero siempre con una estructura clara y controlada.</w:t>
-      </w:r>
-    </w:p>
-    <w:p>
-      <w:pPr>
-        <w:rPr>
-          <w:rFonts w:ascii="Lexend Light" w:cs="Lexend Light" w:eastAsia="Lexend Light" w:hAnsi="Lexend Light"/>
-        </w:rPr>
-      </w:pPr>
-      <w:r>
-        <w:rPr>
-          <w:rtl w:val="0"/>
-        </w:rPr>
       </w:r>
     </w:p>
     <w:sectPr>

</xml_diff>